<commit_message>
docs: Se agregan DoD, retrospectiva y registro de errores
</commit_message>
<xml_diff>
--- a/FASE 2/Evidencias Proyecto/Documentacion/Spring backlogs/Sprint Backlog 02 Persistencia de datos perfil y sesiones.docx
+++ b/FASE 2/Evidencias Proyecto/Documentacion/Spring backlogs/Sprint Backlog 02 Persistencia de datos perfil y sesiones.docx
@@ -180,57 +180,13 @@
           <w:rFonts w:ascii="Calibri" w:hAnsi="Calibri" w:cs="Calibri"/>
         </w:rPr>
         <w:t>Integrantes: Alejandro Silva</w:t>
-      </w:r>
-      <w:r>
-        <w:rPr>
-          <w:rFonts w:ascii="Calibri" w:hAnsi="Calibri" w:cs="Calibri"/>
-        </w:rPr>
         <w:tab/>
-      </w:r>
-      <w:r>
-        <w:rPr>
-          <w:rFonts w:ascii="Calibri" w:hAnsi="Calibri" w:cs="Calibri"/>
-        </w:rPr>
         <w:tab/>
-      </w:r>
-      <w:r>
-        <w:rPr>
-          <w:rFonts w:ascii="Calibri" w:hAnsi="Calibri" w:cs="Calibri"/>
-        </w:rPr>
         <w:tab/>
-      </w:r>
-      <w:r>
-        <w:rPr>
-          <w:rFonts w:ascii="Calibri" w:hAnsi="Calibri" w:cs="Calibri"/>
-        </w:rPr>
         <w:tab/>
-      </w:r>
-      <w:r>
-        <w:rPr>
-          <w:rFonts w:ascii="Calibri" w:hAnsi="Calibri" w:cs="Calibri"/>
-        </w:rPr>
         <w:tab/>
-      </w:r>
-      <w:r>
-        <w:rPr>
-          <w:rFonts w:ascii="Calibri" w:hAnsi="Calibri" w:cs="Calibri"/>
-        </w:rPr>
         <w:tab/>
-        <w:t xml:space="preserve">Docente: </w:t>
-      </w:r>
-      <w:proofErr w:type="spellStart"/>
-      <w:r>
-        <w:rPr>
-          <w:rFonts w:ascii="Calibri" w:hAnsi="Calibri" w:cs="Calibri"/>
-        </w:rPr>
-        <w:t>Maria</w:t>
-      </w:r>
-      <w:proofErr w:type="spellEnd"/>
-      <w:r>
-        <w:rPr>
-          <w:rFonts w:ascii="Calibri" w:hAnsi="Calibri" w:cs="Calibri"/>
-        </w:rPr>
-        <w:t xml:space="preserve"> Cobo</w:t>
+        <w:t xml:space="preserve">Docente: Maria Cobo</w:t>
       </w:r>
     </w:p>
     <w:p>
@@ -309,11 +265,7 @@
           </w:pPr>
           <w:r>
             <w:fldChar w:fldCharType="begin"/>
-          </w:r>
-          <w:r>
             <w:instrText xml:space="preserve"> TOC \o "1-3" \h \z \u </w:instrText>
-          </w:r>
-          <w:r>
             <w:fldChar w:fldCharType="separate"/>
           </w:r>
           <w:hyperlink w:anchor="_Toc241875781" w:history="1">
@@ -331,46 +283,10 @@
                 <w:webHidden/>
               </w:rPr>
               <w:tab/>
-            </w:r>
-            <w:r>
-              <w:rPr>
-                <w:noProof/>
-                <w:webHidden/>
-              </w:rPr>
               <w:fldChar w:fldCharType="begin"/>
-            </w:r>
-            <w:r>
-              <w:rPr>
-                <w:noProof/>
-                <w:webHidden/>
-              </w:rPr>
               <w:instrText xml:space="preserve"> PAGEREF _Toc241875781 \h </w:instrText>
-            </w:r>
-            <w:r>
-              <w:rPr>
-                <w:noProof/>
-                <w:webHidden/>
-              </w:rPr>
-            </w:r>
-            <w:r>
-              <w:rPr>
-                <w:noProof/>
-                <w:webHidden/>
-              </w:rPr>
               <w:fldChar w:fldCharType="separate"/>
-            </w:r>
-            <w:r>
-              <w:rPr>
-                <w:noProof/>
-                <w:webHidden/>
-              </w:rPr>
               <w:t>3</w:t>
-            </w:r>
-            <w:r>
-              <w:rPr>
-                <w:noProof/>
-                <w:webHidden/>
-              </w:rPr>
               <w:fldChar w:fldCharType="end"/>
             </w:r>
           </w:hyperlink>
@@ -402,46 +318,10 @@
                 <w:webHidden/>
               </w:rPr>
               <w:tab/>
-            </w:r>
-            <w:r>
-              <w:rPr>
-                <w:noProof/>
-                <w:webHidden/>
-              </w:rPr>
               <w:fldChar w:fldCharType="begin"/>
-            </w:r>
-            <w:r>
-              <w:rPr>
-                <w:noProof/>
-                <w:webHidden/>
-              </w:rPr>
               <w:instrText xml:space="preserve"> PAGEREF _Toc241875782 \h </w:instrText>
-            </w:r>
-            <w:r>
-              <w:rPr>
-                <w:noProof/>
-                <w:webHidden/>
-              </w:rPr>
-            </w:r>
-            <w:r>
-              <w:rPr>
-                <w:noProof/>
-                <w:webHidden/>
-              </w:rPr>
               <w:fldChar w:fldCharType="separate"/>
-            </w:r>
-            <w:r>
-              <w:rPr>
-                <w:noProof/>
-                <w:webHidden/>
-              </w:rPr>
               <w:t>3</w:t>
-            </w:r>
-            <w:r>
-              <w:rPr>
-                <w:noProof/>
-                <w:webHidden/>
-              </w:rPr>
               <w:fldChar w:fldCharType="end"/>
             </w:r>
           </w:hyperlink>
@@ -473,46 +353,10 @@
                 <w:webHidden/>
               </w:rPr>
               <w:tab/>
-            </w:r>
-            <w:r>
-              <w:rPr>
-                <w:noProof/>
-                <w:webHidden/>
-              </w:rPr>
               <w:fldChar w:fldCharType="begin"/>
-            </w:r>
-            <w:r>
-              <w:rPr>
-                <w:noProof/>
-                <w:webHidden/>
-              </w:rPr>
               <w:instrText xml:space="preserve"> PAGEREF _Toc241875783 \h </w:instrText>
-            </w:r>
-            <w:r>
-              <w:rPr>
-                <w:noProof/>
-                <w:webHidden/>
-              </w:rPr>
-            </w:r>
-            <w:r>
-              <w:rPr>
-                <w:noProof/>
-                <w:webHidden/>
-              </w:rPr>
               <w:fldChar w:fldCharType="separate"/>
-            </w:r>
-            <w:r>
-              <w:rPr>
-                <w:noProof/>
-                <w:webHidden/>
-              </w:rPr>
               <w:t>4</w:t>
-            </w:r>
-            <w:r>
-              <w:rPr>
-                <w:noProof/>
-                <w:webHidden/>
-              </w:rPr>
               <w:fldChar w:fldCharType="end"/>
             </w:r>
           </w:hyperlink>
@@ -544,46 +388,10 @@
                 <w:webHidden/>
               </w:rPr>
               <w:tab/>
-            </w:r>
-            <w:r>
-              <w:rPr>
-                <w:noProof/>
-                <w:webHidden/>
-              </w:rPr>
               <w:fldChar w:fldCharType="begin"/>
-            </w:r>
-            <w:r>
-              <w:rPr>
-                <w:noProof/>
-                <w:webHidden/>
-              </w:rPr>
               <w:instrText xml:space="preserve"> PAGEREF _Toc241875784 \h </w:instrText>
-            </w:r>
-            <w:r>
-              <w:rPr>
-                <w:noProof/>
-                <w:webHidden/>
-              </w:rPr>
-            </w:r>
-            <w:r>
-              <w:rPr>
-                <w:noProof/>
-                <w:webHidden/>
-              </w:rPr>
               <w:fldChar w:fldCharType="separate"/>
-            </w:r>
-            <w:r>
-              <w:rPr>
-                <w:noProof/>
-                <w:webHidden/>
-              </w:rPr>
               <w:t>4</w:t>
-            </w:r>
-            <w:r>
-              <w:rPr>
-                <w:noProof/>
-                <w:webHidden/>
-              </w:rPr>
               <w:fldChar w:fldCharType="end"/>
             </w:r>
           </w:hyperlink>
@@ -615,46 +423,10 @@
                 <w:webHidden/>
               </w:rPr>
               <w:tab/>
-            </w:r>
-            <w:r>
-              <w:rPr>
-                <w:noProof/>
-                <w:webHidden/>
-              </w:rPr>
               <w:fldChar w:fldCharType="begin"/>
-            </w:r>
-            <w:r>
-              <w:rPr>
-                <w:noProof/>
-                <w:webHidden/>
-              </w:rPr>
               <w:instrText xml:space="preserve"> PAGEREF _Toc241875785 \h </w:instrText>
-            </w:r>
-            <w:r>
-              <w:rPr>
-                <w:noProof/>
-                <w:webHidden/>
-              </w:rPr>
-            </w:r>
-            <w:r>
-              <w:rPr>
-                <w:noProof/>
-                <w:webHidden/>
-              </w:rPr>
               <w:fldChar w:fldCharType="separate"/>
-            </w:r>
-            <w:r>
-              <w:rPr>
-                <w:noProof/>
-                <w:webHidden/>
-              </w:rPr>
               <w:t>5</w:t>
-            </w:r>
-            <w:r>
-              <w:rPr>
-                <w:noProof/>
-                <w:webHidden/>
-              </w:rPr>
               <w:fldChar w:fldCharType="end"/>
             </w:r>
           </w:hyperlink>
@@ -686,46 +458,10 @@
                 <w:webHidden/>
               </w:rPr>
               <w:tab/>
-            </w:r>
-            <w:r>
-              <w:rPr>
-                <w:noProof/>
-                <w:webHidden/>
-              </w:rPr>
               <w:fldChar w:fldCharType="begin"/>
-            </w:r>
-            <w:r>
-              <w:rPr>
-                <w:noProof/>
-                <w:webHidden/>
-              </w:rPr>
               <w:instrText xml:space="preserve"> PAGEREF _Toc241875786 \h </w:instrText>
-            </w:r>
-            <w:r>
-              <w:rPr>
-                <w:noProof/>
-                <w:webHidden/>
-              </w:rPr>
-            </w:r>
-            <w:r>
-              <w:rPr>
-                <w:noProof/>
-                <w:webHidden/>
-              </w:rPr>
               <w:fldChar w:fldCharType="separate"/>
-            </w:r>
-            <w:r>
-              <w:rPr>
-                <w:noProof/>
-                <w:webHidden/>
-              </w:rPr>
               <w:t>5</w:t>
-            </w:r>
-            <w:r>
-              <w:rPr>
-                <w:noProof/>
-                <w:webHidden/>
-              </w:rPr>
               <w:fldChar w:fldCharType="end"/>
             </w:r>
           </w:hyperlink>
@@ -757,46 +493,10 @@
                 <w:webHidden/>
               </w:rPr>
               <w:tab/>
-            </w:r>
-            <w:r>
-              <w:rPr>
-                <w:noProof/>
-                <w:webHidden/>
-              </w:rPr>
               <w:fldChar w:fldCharType="begin"/>
-            </w:r>
-            <w:r>
-              <w:rPr>
-                <w:noProof/>
-                <w:webHidden/>
-              </w:rPr>
               <w:instrText xml:space="preserve"> PAGEREF _Toc241875787 \h </w:instrText>
-            </w:r>
-            <w:r>
-              <w:rPr>
-                <w:noProof/>
-                <w:webHidden/>
-              </w:rPr>
-            </w:r>
-            <w:r>
-              <w:rPr>
-                <w:noProof/>
-                <w:webHidden/>
-              </w:rPr>
               <w:fldChar w:fldCharType="separate"/>
-            </w:r>
-            <w:r>
-              <w:rPr>
-                <w:noProof/>
-                <w:webHidden/>
-              </w:rPr>
               <w:t>5</w:t>
-            </w:r>
-            <w:r>
-              <w:rPr>
-                <w:noProof/>
-                <w:webHidden/>
-              </w:rPr>
               <w:fldChar w:fldCharType="end"/>
             </w:r>
           </w:hyperlink>
@@ -828,46 +528,10 @@
                 <w:webHidden/>
               </w:rPr>
               <w:tab/>
-            </w:r>
-            <w:r>
-              <w:rPr>
-                <w:noProof/>
-                <w:webHidden/>
-              </w:rPr>
               <w:fldChar w:fldCharType="begin"/>
-            </w:r>
-            <w:r>
-              <w:rPr>
-                <w:noProof/>
-                <w:webHidden/>
-              </w:rPr>
               <w:instrText xml:space="preserve"> PAGEREF _Toc241875788 \h </w:instrText>
-            </w:r>
-            <w:r>
-              <w:rPr>
-                <w:noProof/>
-                <w:webHidden/>
-              </w:rPr>
-            </w:r>
-            <w:r>
-              <w:rPr>
-                <w:noProof/>
-                <w:webHidden/>
-              </w:rPr>
               <w:fldChar w:fldCharType="separate"/>
-            </w:r>
-            <w:r>
-              <w:rPr>
-                <w:noProof/>
-                <w:webHidden/>
-              </w:rPr>
               <w:t>6</w:t>
-            </w:r>
-            <w:r>
-              <w:rPr>
-                <w:noProof/>
-                <w:webHidden/>
-              </w:rPr>
               <w:fldChar w:fldCharType="end"/>
             </w:r>
           </w:hyperlink>
@@ -899,46 +563,10 @@
                 <w:webHidden/>
               </w:rPr>
               <w:tab/>
-            </w:r>
-            <w:r>
-              <w:rPr>
-                <w:noProof/>
-                <w:webHidden/>
-              </w:rPr>
               <w:fldChar w:fldCharType="begin"/>
-            </w:r>
-            <w:r>
-              <w:rPr>
-                <w:noProof/>
-                <w:webHidden/>
-              </w:rPr>
               <w:instrText xml:space="preserve"> PAGEREF _Toc241875789 \h </w:instrText>
-            </w:r>
-            <w:r>
-              <w:rPr>
-                <w:noProof/>
-                <w:webHidden/>
-              </w:rPr>
-            </w:r>
-            <w:r>
-              <w:rPr>
-                <w:noProof/>
-                <w:webHidden/>
-              </w:rPr>
               <w:fldChar w:fldCharType="separate"/>
-            </w:r>
-            <w:r>
-              <w:rPr>
-                <w:noProof/>
-                <w:webHidden/>
-              </w:rPr>
               <w:t>6</w:t>
-            </w:r>
-            <w:r>
-              <w:rPr>
-                <w:noProof/>
-                <w:webHidden/>
-              </w:rPr>
               <w:fldChar w:fldCharType="end"/>
             </w:r>
           </w:hyperlink>
@@ -970,46 +598,10 @@
                 <w:webHidden/>
               </w:rPr>
               <w:tab/>
-            </w:r>
-            <w:r>
-              <w:rPr>
-                <w:noProof/>
-                <w:webHidden/>
-              </w:rPr>
               <w:fldChar w:fldCharType="begin"/>
-            </w:r>
-            <w:r>
-              <w:rPr>
-                <w:noProof/>
-                <w:webHidden/>
-              </w:rPr>
               <w:instrText xml:space="preserve"> PAGEREF _Toc241875790 \h </w:instrText>
-            </w:r>
-            <w:r>
-              <w:rPr>
-                <w:noProof/>
-                <w:webHidden/>
-              </w:rPr>
-            </w:r>
-            <w:r>
-              <w:rPr>
-                <w:noProof/>
-                <w:webHidden/>
-              </w:rPr>
               <w:fldChar w:fldCharType="separate"/>
-            </w:r>
-            <w:r>
-              <w:rPr>
-                <w:noProof/>
-                <w:webHidden/>
-              </w:rPr>
               <w:t>7</w:t>
-            </w:r>
-            <w:r>
-              <w:rPr>
-                <w:noProof/>
-                <w:webHidden/>
-              </w:rPr>
               <w:fldChar w:fldCharType="end"/>
             </w:r>
           </w:hyperlink>
@@ -1041,46 +633,10 @@
                 <w:webHidden/>
               </w:rPr>
               <w:tab/>
-            </w:r>
-            <w:r>
-              <w:rPr>
-                <w:noProof/>
-                <w:webHidden/>
-              </w:rPr>
               <w:fldChar w:fldCharType="begin"/>
-            </w:r>
-            <w:r>
-              <w:rPr>
-                <w:noProof/>
-                <w:webHidden/>
-              </w:rPr>
               <w:instrText xml:space="preserve"> PAGEREF _Toc241875791 \h </w:instrText>
-            </w:r>
-            <w:r>
-              <w:rPr>
-                <w:noProof/>
-                <w:webHidden/>
-              </w:rPr>
-            </w:r>
-            <w:r>
-              <w:rPr>
-                <w:noProof/>
-                <w:webHidden/>
-              </w:rPr>
               <w:fldChar w:fldCharType="separate"/>
-            </w:r>
-            <w:r>
-              <w:rPr>
-                <w:noProof/>
-                <w:webHidden/>
-              </w:rPr>
               <w:t>9</w:t>
-            </w:r>
-            <w:r>
-              <w:rPr>
-                <w:noProof/>
-                <w:webHidden/>
-              </w:rPr>
               <w:fldChar w:fldCharType="end"/>
             </w:r>
           </w:hyperlink>
@@ -1112,46 +668,10 @@
                 <w:webHidden/>
               </w:rPr>
               <w:tab/>
-            </w:r>
-            <w:r>
-              <w:rPr>
-                <w:noProof/>
-                <w:webHidden/>
-              </w:rPr>
               <w:fldChar w:fldCharType="begin"/>
-            </w:r>
-            <w:r>
-              <w:rPr>
-                <w:noProof/>
-                <w:webHidden/>
-              </w:rPr>
               <w:instrText xml:space="preserve"> PAGEREF _Toc241875792 \h </w:instrText>
-            </w:r>
-            <w:r>
-              <w:rPr>
-                <w:noProof/>
-                <w:webHidden/>
-              </w:rPr>
-            </w:r>
-            <w:r>
-              <w:rPr>
-                <w:noProof/>
-                <w:webHidden/>
-              </w:rPr>
               <w:fldChar w:fldCharType="separate"/>
-            </w:r>
-            <w:r>
-              <w:rPr>
-                <w:noProof/>
-                <w:webHidden/>
-              </w:rPr>
               <w:t>10</w:t>
-            </w:r>
-            <w:r>
-              <w:rPr>
-                <w:noProof/>
-                <w:webHidden/>
-              </w:rPr>
               <w:fldChar w:fldCharType="end"/>
             </w:r>
           </w:hyperlink>
@@ -1183,46 +703,10 @@
                 <w:webHidden/>
               </w:rPr>
               <w:tab/>
-            </w:r>
-            <w:r>
-              <w:rPr>
-                <w:noProof/>
-                <w:webHidden/>
-              </w:rPr>
               <w:fldChar w:fldCharType="begin"/>
-            </w:r>
-            <w:r>
-              <w:rPr>
-                <w:noProof/>
-                <w:webHidden/>
-              </w:rPr>
               <w:instrText xml:space="preserve"> PAGEREF _Toc241875793 \h </w:instrText>
-            </w:r>
-            <w:r>
-              <w:rPr>
-                <w:noProof/>
-                <w:webHidden/>
-              </w:rPr>
-            </w:r>
-            <w:r>
-              <w:rPr>
-                <w:noProof/>
-                <w:webHidden/>
-              </w:rPr>
               <w:fldChar w:fldCharType="separate"/>
-            </w:r>
-            <w:r>
-              <w:rPr>
-                <w:noProof/>
-                <w:webHidden/>
-              </w:rPr>
               <w:t>11</w:t>
-            </w:r>
-            <w:r>
-              <w:rPr>
-                <w:noProof/>
-                <w:webHidden/>
-              </w:rPr>
               <w:fldChar w:fldCharType="end"/>
             </w:r>
           </w:hyperlink>
@@ -1254,46 +738,10 @@
                 <w:webHidden/>
               </w:rPr>
               <w:tab/>
-            </w:r>
-            <w:r>
-              <w:rPr>
-                <w:noProof/>
-                <w:webHidden/>
-              </w:rPr>
               <w:fldChar w:fldCharType="begin"/>
-            </w:r>
-            <w:r>
-              <w:rPr>
-                <w:noProof/>
-                <w:webHidden/>
-              </w:rPr>
               <w:instrText xml:space="preserve"> PAGEREF _Toc241875794 \h </w:instrText>
-            </w:r>
-            <w:r>
-              <w:rPr>
-                <w:noProof/>
-                <w:webHidden/>
-              </w:rPr>
-            </w:r>
-            <w:r>
-              <w:rPr>
-                <w:noProof/>
-                <w:webHidden/>
-              </w:rPr>
               <w:fldChar w:fldCharType="separate"/>
-            </w:r>
-            <w:r>
-              <w:rPr>
-                <w:noProof/>
-                <w:webHidden/>
-              </w:rPr>
               <w:t>12</w:t>
-            </w:r>
-            <w:r>
-              <w:rPr>
-                <w:noProof/>
-                <w:webHidden/>
-              </w:rPr>
               <w:fldChar w:fldCharType="end"/>
             </w:r>
           </w:hyperlink>
@@ -1325,46 +773,10 @@
                 <w:webHidden/>
               </w:rPr>
               <w:tab/>
-            </w:r>
-            <w:r>
-              <w:rPr>
-                <w:noProof/>
-                <w:webHidden/>
-              </w:rPr>
               <w:fldChar w:fldCharType="begin"/>
-            </w:r>
-            <w:r>
-              <w:rPr>
-                <w:noProof/>
-                <w:webHidden/>
-              </w:rPr>
               <w:instrText xml:space="preserve"> PAGEREF _Toc241875795 \h </w:instrText>
-            </w:r>
-            <w:r>
-              <w:rPr>
-                <w:noProof/>
-                <w:webHidden/>
-              </w:rPr>
-            </w:r>
-            <w:r>
-              <w:rPr>
-                <w:noProof/>
-                <w:webHidden/>
-              </w:rPr>
               <w:fldChar w:fldCharType="separate"/>
-            </w:r>
-            <w:r>
-              <w:rPr>
-                <w:noProof/>
-                <w:webHidden/>
-              </w:rPr>
               <w:t>12</w:t>
-            </w:r>
-            <w:r>
-              <w:rPr>
-                <w:noProof/>
-                <w:webHidden/>
-              </w:rPr>
               <w:fldChar w:fldCharType="end"/>
             </w:r>
           </w:hyperlink>
@@ -1396,46 +808,10 @@
                 <w:webHidden/>
               </w:rPr>
               <w:tab/>
-            </w:r>
-            <w:r>
-              <w:rPr>
-                <w:noProof/>
-                <w:webHidden/>
-              </w:rPr>
               <w:fldChar w:fldCharType="begin"/>
-            </w:r>
-            <w:r>
-              <w:rPr>
-                <w:noProof/>
-                <w:webHidden/>
-              </w:rPr>
               <w:instrText xml:space="preserve"> PAGEREF _Toc241875796 \h </w:instrText>
-            </w:r>
-            <w:r>
-              <w:rPr>
-                <w:noProof/>
-                <w:webHidden/>
-              </w:rPr>
-            </w:r>
-            <w:r>
-              <w:rPr>
-                <w:noProof/>
-                <w:webHidden/>
-              </w:rPr>
               <w:fldChar w:fldCharType="separate"/>
-            </w:r>
-            <w:r>
-              <w:rPr>
-                <w:noProof/>
-                <w:webHidden/>
-              </w:rPr>
               <w:t>12</w:t>
-            </w:r>
-            <w:r>
-              <w:rPr>
-                <w:noProof/>
-                <w:webHidden/>
-              </w:rPr>
               <w:fldChar w:fldCharType="end"/>
             </w:r>
           </w:hyperlink>
@@ -1467,46 +843,10 @@
                 <w:webHidden/>
               </w:rPr>
               <w:tab/>
-            </w:r>
-            <w:r>
-              <w:rPr>
-                <w:noProof/>
-                <w:webHidden/>
-              </w:rPr>
               <w:fldChar w:fldCharType="begin"/>
-            </w:r>
-            <w:r>
-              <w:rPr>
-                <w:noProof/>
-                <w:webHidden/>
-              </w:rPr>
               <w:instrText xml:space="preserve"> PAGEREF _Toc241875797 \h </w:instrText>
-            </w:r>
-            <w:r>
-              <w:rPr>
-                <w:noProof/>
-                <w:webHidden/>
-              </w:rPr>
-            </w:r>
-            <w:r>
-              <w:rPr>
-                <w:noProof/>
-                <w:webHidden/>
-              </w:rPr>
               <w:fldChar w:fldCharType="separate"/>
-            </w:r>
-            <w:r>
-              <w:rPr>
-                <w:noProof/>
-                <w:webHidden/>
-              </w:rPr>
               <w:t>13</w:t>
-            </w:r>
-            <w:r>
-              <w:rPr>
-                <w:noProof/>
-                <w:webHidden/>
-              </w:rPr>
               <w:fldChar w:fldCharType="end"/>
             </w:r>
           </w:hyperlink>
@@ -1538,46 +878,10 @@
                 <w:webHidden/>
               </w:rPr>
               <w:tab/>
-            </w:r>
-            <w:r>
-              <w:rPr>
-                <w:noProof/>
-                <w:webHidden/>
-              </w:rPr>
               <w:fldChar w:fldCharType="begin"/>
-            </w:r>
-            <w:r>
-              <w:rPr>
-                <w:noProof/>
-                <w:webHidden/>
-              </w:rPr>
               <w:instrText xml:space="preserve"> PAGEREF _Toc241875798 \h </w:instrText>
-            </w:r>
-            <w:r>
-              <w:rPr>
-                <w:noProof/>
-                <w:webHidden/>
-              </w:rPr>
-            </w:r>
-            <w:r>
-              <w:rPr>
-                <w:noProof/>
-                <w:webHidden/>
-              </w:rPr>
               <w:fldChar w:fldCharType="separate"/>
-            </w:r>
-            <w:r>
-              <w:rPr>
-                <w:noProof/>
-                <w:webHidden/>
-              </w:rPr>
               <w:t>13</w:t>
-            </w:r>
-            <w:r>
-              <w:rPr>
-                <w:noProof/>
-                <w:webHidden/>
-              </w:rPr>
               <w:fldChar w:fldCharType="end"/>
             </w:r>
           </w:hyperlink>
@@ -1609,46 +913,10 @@
                 <w:webHidden/>
               </w:rPr>
               <w:tab/>
-            </w:r>
-            <w:r>
-              <w:rPr>
-                <w:noProof/>
-                <w:webHidden/>
-              </w:rPr>
               <w:fldChar w:fldCharType="begin"/>
-            </w:r>
-            <w:r>
-              <w:rPr>
-                <w:noProof/>
-                <w:webHidden/>
-              </w:rPr>
               <w:instrText xml:space="preserve"> PAGEREF _Toc241875799 \h </w:instrText>
-            </w:r>
-            <w:r>
-              <w:rPr>
-                <w:noProof/>
-                <w:webHidden/>
-              </w:rPr>
-            </w:r>
-            <w:r>
-              <w:rPr>
-                <w:noProof/>
-                <w:webHidden/>
-              </w:rPr>
               <w:fldChar w:fldCharType="separate"/>
-            </w:r>
-            <w:r>
-              <w:rPr>
-                <w:noProof/>
-                <w:webHidden/>
-              </w:rPr>
               <w:t>14</w:t>
-            </w:r>
-            <w:r>
-              <w:rPr>
-                <w:noProof/>
-                <w:webHidden/>
-              </w:rPr>
               <w:fldChar w:fldCharType="end"/>
             </w:r>
           </w:hyperlink>
@@ -1704,7 +972,6 @@
         </w:rPr>
         <w:t xml:space="preserve">Proyecto: </w:t>
       </w:r>
-      <w:proofErr w:type="spellStart"/>
       <w:r>
         <w:rPr>
           <w:rFonts w:ascii="Calibri" w:hAnsi="Calibri" w:cs="Calibri"/>
@@ -1713,7 +980,6 @@
         </w:rPr>
         <w:t>ErgoSense</w:t>
       </w:r>
-      <w:proofErr w:type="spellEnd"/>
       <w:r>
         <w:br/>
       </w:r>
@@ -1801,7 +1067,6 @@
       <w:r>
         <w:br/>
       </w:r>
-      <w:proofErr w:type="spellStart"/>
       <w:r>
         <w:rPr>
           <w:rFonts w:ascii="Calibri" w:hAnsi="Calibri" w:cs="Calibri"/>
@@ -1810,40 +1075,7 @@
           <w:sz w:val="20"/>
           <w:szCs w:val="20"/>
         </w:rPr>
-        <w:t>Product</w:t>
-      </w:r>
-      <w:proofErr w:type="spellEnd"/>
-      <w:r>
-        <w:rPr>
-          <w:rFonts w:ascii="Calibri" w:hAnsi="Calibri" w:cs="Calibri"/>
-          <w:b/>
-          <w:bCs/>
-          <w:sz w:val="20"/>
-          <w:szCs w:val="20"/>
-        </w:rPr>
-        <w:t xml:space="preserve"> Backlog </w:t>
-      </w:r>
-      <w:proofErr w:type="spellStart"/>
-      <w:r>
-        <w:rPr>
-          <w:rFonts w:ascii="Calibri" w:hAnsi="Calibri" w:cs="Calibri"/>
-          <w:b/>
-          <w:bCs/>
-          <w:sz w:val="20"/>
-          <w:szCs w:val="20"/>
-        </w:rPr>
-        <w:t>Items</w:t>
-      </w:r>
-      <w:proofErr w:type="spellEnd"/>
-      <w:r>
-        <w:rPr>
-          <w:rFonts w:ascii="Calibri" w:hAnsi="Calibri" w:cs="Calibri"/>
-          <w:b/>
-          <w:bCs/>
-          <w:sz w:val="20"/>
-          <w:szCs w:val="20"/>
-        </w:rPr>
-        <w:t xml:space="preserve"> asociados: </w:t>
+        <w:t xml:space="preserve">Product Backlog Items asociados: </w:t>
       </w:r>
       <w:r>
         <w:rPr>
@@ -1896,115 +1128,43 @@
           <w:sz w:val="20"/>
           <w:szCs w:val="20"/>
         </w:rPr>
-        <w:t xml:space="preserve">Con el monitoreo de actividad disponible, el segundo Sprint tiene como propósito incorporar la capa de persistencia de </w:t>
-      </w:r>
-      <w:proofErr w:type="spellStart"/>
-      <w:r>
-        <w:rPr>
-          <w:rFonts w:ascii="Calibri" w:hAnsi="Calibri" w:cs="Calibri"/>
-          <w:sz w:val="20"/>
-          <w:szCs w:val="20"/>
-        </w:rPr>
-        <w:t>ErgoSense</w:t>
-      </w:r>
-      <w:proofErr w:type="spellEnd"/>
-      <w:r>
-        <w:rPr>
-          <w:rFonts w:ascii="Calibri" w:hAnsi="Calibri" w:cs="Calibri"/>
-          <w:sz w:val="20"/>
-          <w:szCs w:val="20"/>
-        </w:rPr>
-        <w:t>. Hasta este punto, la información generada por la aplicación existe solo mientras se encuentra en ejecución: al cerrarla, se pierde el registro del uso realizado.</w:t>
-      </w:r>
-    </w:p>
-    <w:p>
-      <w:pPr>
-        <w:jc w:val="both"/>
-        <w:rPr>
-          <w:rFonts w:ascii="Calibri" w:hAnsi="Calibri" w:cs="Calibri"/>
-          <w:sz w:val="20"/>
-          <w:szCs w:val="20"/>
-        </w:rPr>
-      </w:pPr>
-      <w:r>
-        <w:rPr>
-          <w:rFonts w:ascii="Calibri" w:hAnsi="Calibri" w:cs="Calibri"/>
-          <w:sz w:val="20"/>
-          <w:szCs w:val="20"/>
-        </w:rPr>
-        <w:t xml:space="preserve">Para resolverlo, el equipo desarrollará el servidor de </w:t>
-      </w:r>
-      <w:proofErr w:type="spellStart"/>
-      <w:r>
-        <w:rPr>
-          <w:rFonts w:ascii="Calibri" w:hAnsi="Calibri" w:cs="Calibri"/>
-          <w:sz w:val="20"/>
-          <w:szCs w:val="20"/>
-        </w:rPr>
-        <w:t>ErgoSense</w:t>
-      </w:r>
-      <w:proofErr w:type="spellEnd"/>
-      <w:r>
-        <w:rPr>
-          <w:rFonts w:ascii="Calibri" w:hAnsi="Calibri" w:cs="Calibri"/>
-          <w:sz w:val="20"/>
-          <w:szCs w:val="20"/>
-        </w:rPr>
-        <w:t xml:space="preserve">, compuesto por una API REST y una base de datos PostgreSQL ejecutadas en contenedores Docker, según el modelo de datos definido en el </w:t>
-      </w:r>
-      <w:proofErr w:type="spellStart"/>
-      <w:r>
-        <w:rPr>
-          <w:rFonts w:ascii="Calibri" w:hAnsi="Calibri" w:cs="Calibri"/>
-          <w:sz w:val="20"/>
-          <w:szCs w:val="20"/>
-        </w:rPr>
-        <w:t>Product</w:t>
-      </w:r>
-      <w:proofErr w:type="spellEnd"/>
-      <w:r>
-        <w:rPr>
-          <w:rFonts w:ascii="Calibri" w:hAnsi="Calibri" w:cs="Calibri"/>
-          <w:sz w:val="20"/>
-          <w:szCs w:val="20"/>
-        </w:rPr>
-        <w:t xml:space="preserve"> Backlog. Sobre este servidor se implementarán las cuentas de usuario, con su configuración por defecto, el inicio y cierre de sesión, y el almacenamiento de las sesiones de uso y las pausas detectadas por inactividad.</w:t>
-      </w:r>
-    </w:p>
-    <w:p>
-      <w:pPr>
-        <w:jc w:val="both"/>
-        <w:rPr>
-          <w:rFonts w:ascii="Calibri" w:hAnsi="Calibri" w:cs="Calibri"/>
-          <w:sz w:val="20"/>
-          <w:szCs w:val="20"/>
-        </w:rPr>
-      </w:pPr>
-      <w:r>
-        <w:rPr>
-          <w:rFonts w:ascii="Calibri" w:hAnsi="Calibri" w:cs="Calibri"/>
-          <w:sz w:val="20"/>
-          <w:szCs w:val="20"/>
-        </w:rPr>
-        <w:t xml:space="preserve">La base de datos se creará completa desde este Sprint, incluyendo las tablas que la configuración y las macros utilizarán más adelante. De esta forma, los </w:t>
-      </w:r>
-      <w:proofErr w:type="spellStart"/>
-      <w:r>
-        <w:rPr>
-          <w:rFonts w:ascii="Calibri" w:hAnsi="Calibri" w:cs="Calibri"/>
-          <w:sz w:val="20"/>
-          <w:szCs w:val="20"/>
-        </w:rPr>
-        <w:t>Sprints</w:t>
-      </w:r>
-      <w:proofErr w:type="spellEnd"/>
-      <w:r>
-        <w:rPr>
-          <w:rFonts w:ascii="Calibri" w:hAnsi="Calibri" w:cs="Calibri"/>
-          <w:sz w:val="20"/>
-          <w:szCs w:val="20"/>
-        </w:rPr>
-        <w:t xml:space="preserve"> siguientes podrán apoyarse en una estructura estable, sin necesidad de modificar el modelo cada vez que se incorpora una funcionalidad.</w:t>
+        <w:t xml:space="preserve">Con el monitoreo de actividad disponible, el segundo Sprint tiene como propósito incorporar la capa de persistencia de ErgoSense. Hasta este punto, la información generada por la aplicación existe solo mientras se encuentra en ejecución: al cerrarla, se pierde el registro del uso realizado.</w:t>
+      </w:r>
+    </w:p>
+    <w:p>
+      <w:pPr>
+        <w:jc w:val="both"/>
+        <w:rPr>
+          <w:rFonts w:ascii="Calibri" w:hAnsi="Calibri" w:cs="Calibri"/>
+          <w:sz w:val="20"/>
+          <w:szCs w:val="20"/>
+        </w:rPr>
+      </w:pPr>
+      <w:r>
+        <w:rPr>
+          <w:rFonts w:ascii="Calibri" w:hAnsi="Calibri" w:cs="Calibri"/>
+          <w:sz w:val="20"/>
+          <w:szCs w:val="20"/>
+        </w:rPr>
+        <w:t xml:space="preserve">Para resolverlo, el equipo desarrollará el servidor de ErgoSense, compuesto por una API REST y una base de datos PostgreSQL ejecutadas en contenedores Docker, según el modelo de datos definido en el Product Backlog. Sobre este servidor se implementarán las cuentas de usuario, con su configuración por defecto, el inicio y cierre de sesión, y el almacenamiento de las sesiones de uso y las pausas detectadas por inactividad.</w:t>
+      </w:r>
+    </w:p>
+    <w:p>
+      <w:pPr>
+        <w:jc w:val="both"/>
+        <w:rPr>
+          <w:rFonts w:ascii="Calibri" w:hAnsi="Calibri" w:cs="Calibri"/>
+          <w:sz w:val="20"/>
+          <w:szCs w:val="20"/>
+        </w:rPr>
+      </w:pPr>
+      <w:r>
+        <w:rPr>
+          <w:rFonts w:ascii="Calibri" w:hAnsi="Calibri" w:cs="Calibri"/>
+          <w:sz w:val="20"/>
+          <w:szCs w:val="20"/>
+        </w:rPr>
+        <w:t xml:space="preserve">La base de datos se creará completa desde este Sprint, incluyendo las tablas que la configuración y las macros utilizarán más adelante. De esta forma, los Sprints siguientes podrán apoyarse en una estructura estable, sin necesidad de modificar el modelo cada vez que se incorpora una funcionalidad.</w:t>
       </w:r>
     </w:p>
     <w:p>
@@ -2023,127 +1183,7 @@
           <w:szCs w:val="20"/>
           <w:lang w:val="en-US"/>
         </w:rPr>
-        <w:t xml:space="preserve">El </w:t>
-      </w:r>
-      <w:proofErr w:type="spellStart"/>
-      <w:r>
-        <w:rPr>
-          <w:rFonts w:ascii="Calibri" w:hAnsi="Calibri" w:cs="Calibri"/>
-          <w:sz w:val="20"/>
-          <w:szCs w:val="20"/>
-          <w:lang w:val="en-US"/>
-        </w:rPr>
-        <w:t>modelo</w:t>
-      </w:r>
-      <w:proofErr w:type="spellEnd"/>
-      <w:r>
-        <w:rPr>
-          <w:rFonts w:ascii="Calibri" w:hAnsi="Calibri" w:cs="Calibri"/>
-          <w:sz w:val="20"/>
-          <w:szCs w:val="20"/>
-          <w:lang w:val="en-US"/>
-        </w:rPr>
-        <w:t xml:space="preserve"> </w:t>
-      </w:r>
-      <w:proofErr w:type="spellStart"/>
-      <w:r>
-        <w:rPr>
-          <w:rFonts w:ascii="Calibri" w:hAnsi="Calibri" w:cs="Calibri"/>
-          <w:sz w:val="20"/>
-          <w:szCs w:val="20"/>
-          <w:lang w:val="en-US"/>
-        </w:rPr>
-        <w:t>considera</w:t>
-      </w:r>
-      <w:proofErr w:type="spellEnd"/>
-      <w:r>
-        <w:rPr>
-          <w:rFonts w:ascii="Calibri" w:hAnsi="Calibri" w:cs="Calibri"/>
-          <w:sz w:val="20"/>
-          <w:szCs w:val="20"/>
-          <w:lang w:val="en-US"/>
-        </w:rPr>
-        <w:t xml:space="preserve"> las </w:t>
-      </w:r>
-      <w:proofErr w:type="spellStart"/>
-      <w:r>
-        <w:rPr>
-          <w:rFonts w:ascii="Calibri" w:hAnsi="Calibri" w:cs="Calibri"/>
-          <w:sz w:val="20"/>
-          <w:szCs w:val="20"/>
-          <w:lang w:val="en-US"/>
-        </w:rPr>
-        <w:t>tablas</w:t>
-      </w:r>
-      <w:proofErr w:type="spellEnd"/>
-      <w:r>
-        <w:rPr>
-          <w:rFonts w:ascii="Calibri" w:hAnsi="Calibri" w:cs="Calibri"/>
-          <w:sz w:val="20"/>
-          <w:szCs w:val="20"/>
-          <w:lang w:val="en-US"/>
-        </w:rPr>
-        <w:t xml:space="preserve"> users, settings, </w:t>
-      </w:r>
-      <w:proofErr w:type="spellStart"/>
-      <w:r>
-        <w:rPr>
-          <w:rFonts w:ascii="Calibri" w:hAnsi="Calibri" w:cs="Calibri"/>
-          <w:sz w:val="20"/>
-          <w:szCs w:val="20"/>
-          <w:lang w:val="en-US"/>
-        </w:rPr>
-        <w:t>usage_sessions</w:t>
-      </w:r>
-      <w:proofErr w:type="spellEnd"/>
-      <w:r>
-        <w:rPr>
-          <w:rFonts w:ascii="Calibri" w:hAnsi="Calibri" w:cs="Calibri"/>
-          <w:sz w:val="20"/>
-          <w:szCs w:val="20"/>
-          <w:lang w:val="en-US"/>
-        </w:rPr>
-        <w:t xml:space="preserve">, breaks, macros, </w:t>
-      </w:r>
-      <w:proofErr w:type="spellStart"/>
-      <w:r>
-        <w:rPr>
-          <w:rFonts w:ascii="Calibri" w:hAnsi="Calibri" w:cs="Calibri"/>
-          <w:sz w:val="20"/>
-          <w:szCs w:val="20"/>
-          <w:lang w:val="en-US"/>
-        </w:rPr>
-        <w:t>macro_triggers</w:t>
-      </w:r>
-      <w:proofErr w:type="spellEnd"/>
-      <w:r>
-        <w:rPr>
-          <w:rFonts w:ascii="Calibri" w:hAnsi="Calibri" w:cs="Calibri"/>
-          <w:sz w:val="20"/>
-          <w:szCs w:val="20"/>
-          <w:lang w:val="en-US"/>
-        </w:rPr>
-        <w:t xml:space="preserve">, </w:t>
-      </w:r>
-      <w:proofErr w:type="spellStart"/>
-      <w:r>
-        <w:rPr>
-          <w:rFonts w:ascii="Calibri" w:hAnsi="Calibri" w:cs="Calibri"/>
-          <w:sz w:val="20"/>
-          <w:szCs w:val="20"/>
-          <w:lang w:val="en-US"/>
-        </w:rPr>
-        <w:t>macro_actions</w:t>
-      </w:r>
-      <w:proofErr w:type="spellEnd"/>
-      <w:r>
-        <w:rPr>
-          <w:rFonts w:ascii="Calibri" w:hAnsi="Calibri" w:cs="Calibri"/>
-          <w:sz w:val="20"/>
-          <w:szCs w:val="20"/>
-          <w:lang w:val="en-US"/>
-        </w:rPr>
-        <w:t xml:space="preserve"> y applications. </w:t>
+        <w:t xml:space="preserve">El modelo considera las tablas users, settings, usage_sessions, breaks, macros, macro_triggers, macro_actions y applications. </w:t>
       </w:r>
       <w:r>
         <w:rPr>
@@ -2228,25 +1268,7 @@
           <w:sz w:val="20"/>
           <w:szCs w:val="20"/>
         </w:rPr>
-        <w:t xml:space="preserve">Figura 1. Modelo de datos de </w:t>
-      </w:r>
-      <w:proofErr w:type="spellStart"/>
-      <w:r>
-        <w:rPr>
-          <w:rFonts w:ascii="Calibri" w:hAnsi="Calibri" w:cs="Calibri"/>
-          <w:sz w:val="20"/>
-          <w:szCs w:val="20"/>
-        </w:rPr>
-        <w:t>ErgoSense</w:t>
-      </w:r>
-      <w:proofErr w:type="spellEnd"/>
-      <w:r>
-        <w:rPr>
-          <w:rFonts w:ascii="Calibri" w:hAnsi="Calibri" w:cs="Calibri"/>
-          <w:sz w:val="20"/>
-          <w:szCs w:val="20"/>
-        </w:rPr>
-        <w:t>.</w:t>
+        <w:t xml:space="preserve">Figura 1. Modelo de datos de ErgoSense.</w:t>
       </w:r>
     </w:p>
     <w:p>
@@ -2273,17 +1295,9 @@
           <w:rFonts w:ascii="Calibri" w:hAnsi="Calibri" w:cs="Calibri"/>
         </w:rPr>
         <w:lastRenderedPageBreak/>
-        <w:t xml:space="preserve">3. Sprint </w:t>
-      </w:r>
-      <w:proofErr w:type="spellStart"/>
-      <w:r>
-        <w:rPr>
-          <w:rFonts w:ascii="Calibri" w:hAnsi="Calibri" w:cs="Calibri"/>
-        </w:rPr>
-        <w:t>Goal</w:t>
+        <w:t xml:space="preserve">3. Sprint Goal</w:t>
       </w:r>
       <w:bookmarkEnd w:id="2"/>
-      <w:proofErr w:type="spellEnd"/>
     </w:p>
     <w:p>
       <w:pPr>
@@ -2320,43 +1334,7 @@
           <w:sz w:val="20"/>
           <w:szCs w:val="20"/>
         </w:rPr>
-        <w:t xml:space="preserve">Con este incremento, </w:t>
-      </w:r>
-      <w:proofErr w:type="spellStart"/>
-      <w:r>
-        <w:rPr>
-          <w:rFonts w:ascii="Calibri" w:hAnsi="Calibri" w:cs="Calibri"/>
-          <w:sz w:val="20"/>
-          <w:szCs w:val="20"/>
-        </w:rPr>
-        <w:t>ErgoSense</w:t>
-      </w:r>
-      <w:proofErr w:type="spellEnd"/>
-      <w:r>
-        <w:rPr>
-          <w:rFonts w:ascii="Calibri" w:hAnsi="Calibri" w:cs="Calibri"/>
-          <w:sz w:val="20"/>
-          <w:szCs w:val="20"/>
-        </w:rPr>
-        <w:t xml:space="preserve"> dejará de depender únicamente de la información en memoria y contará con la base necesaria para la configuración, las macros y la integración de los </w:t>
-      </w:r>
-      <w:proofErr w:type="spellStart"/>
-      <w:r>
-        <w:rPr>
-          <w:rFonts w:ascii="Calibri" w:hAnsi="Calibri" w:cs="Calibri"/>
-          <w:sz w:val="20"/>
-          <w:szCs w:val="20"/>
-        </w:rPr>
-        <w:t>Sprints</w:t>
-      </w:r>
-      <w:proofErr w:type="spellEnd"/>
-      <w:r>
-        <w:rPr>
-          <w:rFonts w:ascii="Calibri" w:hAnsi="Calibri" w:cs="Calibri"/>
-          <w:sz w:val="20"/>
-          <w:szCs w:val="20"/>
-        </w:rPr>
-        <w:t xml:space="preserve"> siguientes.</w:t>
+        <w:t xml:space="preserve">Con este incremento, ErgoSense dejará de depender únicamente de la información en memoria y contará con la base necesaria para la configuración, las macros y la integración de los Sprints siguientes.</w:t>
       </w:r>
     </w:p>
     <w:p>
@@ -2384,23 +1362,7 @@
           <w:rFonts w:ascii="Calibri" w:hAnsi="Calibri" w:cs="Calibri"/>
           <w:lang w:val="en-US"/>
         </w:rPr>
-        <w:t xml:space="preserve">4. </w:t>
-      </w:r>
-      <w:proofErr w:type="spellStart"/>
-      <w:r>
-        <w:rPr>
-          <w:rFonts w:ascii="Calibri" w:hAnsi="Calibri" w:cs="Calibri"/>
-          <w:lang w:val="en-US"/>
-        </w:rPr>
-        <w:t>Alcance</w:t>
-      </w:r>
-      <w:proofErr w:type="spellEnd"/>
-      <w:r>
-        <w:rPr>
-          <w:rFonts w:ascii="Calibri" w:hAnsi="Calibri" w:cs="Calibri"/>
-          <w:lang w:val="en-US"/>
-        </w:rPr>
-        <w:t xml:space="preserve"> del Sprint</w:t>
+        <w:t xml:space="preserve">4. Alcance del Sprint</w:t>
       </w:r>
       <w:bookmarkEnd w:id="3"/>
     </w:p>
@@ -2424,21 +1386,8 @@
           <w:szCs w:val="20"/>
           <w:lang w:val="en-US"/>
         </w:rPr>
-        <w:t xml:space="preserve">Product Backlog Items </w:t>
-      </w:r>
-      <w:proofErr w:type="spellStart"/>
-      <w:r>
-        <w:rPr>
-          <w:rFonts w:ascii="Calibri" w:hAnsi="Calibri" w:cs="Calibri"/>
-          <w:b/>
-          <w:bCs/>
-          <w:sz w:val="20"/>
-          <w:szCs w:val="20"/>
-          <w:lang w:val="en-US"/>
-        </w:rPr>
-        <w:t>incluidos</w:t>
-      </w:r>
-      <w:proofErr w:type="spellEnd"/>
+        <w:t xml:space="preserve">Product Backlog Items incluidos</w:t>
+      </w:r>
     </w:p>
     <w:p>
       <w:pPr>
@@ -2456,25 +1405,7 @@
           <w:sz w:val="20"/>
           <w:szCs w:val="20"/>
         </w:rPr>
-        <w:t xml:space="preserve">Durante este Sprint se trabajarán los siguientes elementos del </w:t>
-      </w:r>
-      <w:proofErr w:type="spellStart"/>
-      <w:r>
-        <w:rPr>
-          <w:rFonts w:ascii="Calibri" w:hAnsi="Calibri" w:cs="Calibri"/>
-          <w:sz w:val="20"/>
-          <w:szCs w:val="20"/>
-        </w:rPr>
-        <w:t>Product</w:t>
-      </w:r>
-      <w:proofErr w:type="spellEnd"/>
-      <w:r>
-        <w:rPr>
-          <w:rFonts w:ascii="Calibri" w:hAnsi="Calibri" w:cs="Calibri"/>
-          <w:sz w:val="20"/>
-          <w:szCs w:val="20"/>
-        </w:rPr>
-        <w:t xml:space="preserve"> Backlog:</w:t>
+        <w:t xml:space="preserve">Durante este Sprint se trabajarán los siguientes elementos del Product Backlog:</w:t>
       </w:r>
     </w:p>
     <w:tbl>
@@ -3184,18 +2115,8 @@
                 <w:sz w:val="20"/>
                 <w:szCs w:val="20"/>
               </w:rPr>
-              <w:t xml:space="preserve">Implementar servidor de </w:t>
-            </w:r>
-            <w:proofErr w:type="spellStart"/>
-            <w:r>
-              <w:rPr>
-                <w:rFonts w:ascii="Calibri" w:hAnsi="Calibri" w:cs="Calibri"/>
-                <w:sz w:val="20"/>
-                <w:szCs w:val="20"/>
-              </w:rPr>
-              <w:t>ErgoSense</w:t>
-            </w:r>
-            <w:proofErr w:type="spellEnd"/>
+              <w:t xml:space="preserve">Implementar servidor de ErgoSense</w:t>
+            </w:r>
           </w:p>
         </w:tc>
         <w:tc>
@@ -3274,25 +2195,7 @@
           <w:sz w:val="20"/>
           <w:szCs w:val="20"/>
         </w:rPr>
-        <w:t xml:space="preserve">Servidor de </w:t>
-      </w:r>
-      <w:proofErr w:type="spellStart"/>
-      <w:r>
-        <w:rPr>
-          <w:rFonts w:ascii="Calibri" w:hAnsi="Calibri" w:cs="Calibri"/>
-          <w:sz w:val="20"/>
-          <w:szCs w:val="20"/>
-        </w:rPr>
-        <w:t>ErgoSense</w:t>
-      </w:r>
-      <w:proofErr w:type="spellEnd"/>
-      <w:r>
-        <w:rPr>
-          <w:rFonts w:ascii="Calibri" w:hAnsi="Calibri" w:cs="Calibri"/>
-          <w:sz w:val="20"/>
-          <w:szCs w:val="20"/>
-        </w:rPr>
-        <w:t xml:space="preserve"> con API REST y base de datos PostgreSQL con las ocho tablas del modelo, ejecutados en contenedores Docker.</w:t>
+        <w:t xml:space="preserve">Servidor de ErgoSense con API REST y base de datos PostgreSQL con las ocho tablas del modelo, ejecutados en contenedores Docker.</w:t>
       </w:r>
     </w:p>
     <w:p>
@@ -3504,35 +2407,7 @@
         <w:rPr>
           <w:rFonts w:ascii="Calibri" w:hAnsi="Calibri" w:cs="Calibri"/>
         </w:rPr>
-        <w:t xml:space="preserve">5. </w:t>
-      </w:r>
-      <w:proofErr w:type="spellStart"/>
-      <w:r>
-        <w:rPr>
-          <w:rFonts w:ascii="Calibri" w:hAnsi="Calibri" w:cs="Calibri"/>
-        </w:rPr>
-        <w:t>Product</w:t>
-      </w:r>
-      <w:proofErr w:type="spellEnd"/>
-      <w:r>
-        <w:rPr>
-          <w:rFonts w:ascii="Calibri" w:hAnsi="Calibri" w:cs="Calibri"/>
-        </w:rPr>
-        <w:t xml:space="preserve"> Backlog </w:t>
-      </w:r>
-      <w:proofErr w:type="spellStart"/>
-      <w:r>
-        <w:rPr>
-          <w:rFonts w:ascii="Calibri" w:hAnsi="Calibri" w:cs="Calibri"/>
-        </w:rPr>
-        <w:t>Items</w:t>
-      </w:r>
-      <w:proofErr w:type="spellEnd"/>
-      <w:r>
-        <w:rPr>
-          <w:rFonts w:ascii="Calibri" w:hAnsi="Calibri" w:cs="Calibri"/>
-        </w:rPr>
-        <w:t xml:space="preserve"> seleccionados</w:t>
+        <w:t xml:space="preserve">5. Product Backlog Items seleccionados</w:t>
       </w:r>
       <w:bookmarkEnd w:id="4"/>
     </w:p>
@@ -3589,43 +2464,7 @@
           <w:sz w:val="20"/>
           <w:szCs w:val="20"/>
         </w:rPr>
-        <w:t xml:space="preserve">El sistema deberá contar con una base de datos PostgreSQL, alojada en el servidor de </w:t>
-      </w:r>
-      <w:proofErr w:type="spellStart"/>
-      <w:r>
-        <w:rPr>
-          <w:rFonts w:ascii="Calibri" w:hAnsi="Calibri" w:cs="Calibri"/>
-          <w:sz w:val="20"/>
-          <w:szCs w:val="20"/>
-        </w:rPr>
-        <w:t>ErgoSense</w:t>
-      </w:r>
-      <w:proofErr w:type="spellEnd"/>
-      <w:r>
-        <w:rPr>
-          <w:rFonts w:ascii="Calibri" w:hAnsi="Calibri" w:cs="Calibri"/>
-          <w:sz w:val="20"/>
-          <w:szCs w:val="20"/>
-        </w:rPr>
-        <w:t xml:space="preserve">, que almacene la información según el modelo de datos definido en el </w:t>
-      </w:r>
-      <w:proofErr w:type="spellStart"/>
-      <w:r>
-        <w:rPr>
-          <w:rFonts w:ascii="Calibri" w:hAnsi="Calibri" w:cs="Calibri"/>
-          <w:sz w:val="20"/>
-          <w:szCs w:val="20"/>
-        </w:rPr>
-        <w:t>Product</w:t>
-      </w:r>
-      <w:proofErr w:type="spellEnd"/>
-      <w:r>
-        <w:rPr>
-          <w:rFonts w:ascii="Calibri" w:hAnsi="Calibri" w:cs="Calibri"/>
-          <w:sz w:val="20"/>
-          <w:szCs w:val="20"/>
-        </w:rPr>
-        <w:t xml:space="preserve"> Backlog.</w:t>
+        <w:t xml:space="preserve">El sistema deberá contar con una base de datos PostgreSQL, alojada en el servidor de ErgoSense, que almacene la información según el modelo de datos definido en el Product Backlog.</w:t>
       </w:r>
     </w:p>
     <w:p>
@@ -3749,127 +2588,7 @@
           <w:szCs w:val="20"/>
           <w:lang w:val="en-US"/>
         </w:rPr>
-        <w:t xml:space="preserve">Se </w:t>
-      </w:r>
-      <w:proofErr w:type="spellStart"/>
-      <w:r>
-        <w:rPr>
-          <w:rFonts w:ascii="Calibri" w:hAnsi="Calibri" w:cs="Calibri"/>
-          <w:sz w:val="20"/>
-          <w:szCs w:val="20"/>
-          <w:lang w:val="en-US"/>
-        </w:rPr>
-        <w:t>crean</w:t>
-      </w:r>
-      <w:proofErr w:type="spellEnd"/>
-      <w:r>
-        <w:rPr>
-          <w:rFonts w:ascii="Calibri" w:hAnsi="Calibri" w:cs="Calibri"/>
-          <w:sz w:val="20"/>
-          <w:szCs w:val="20"/>
-          <w:lang w:val="en-US"/>
-        </w:rPr>
-        <w:t xml:space="preserve"> las </w:t>
-      </w:r>
-      <w:proofErr w:type="spellStart"/>
-      <w:r>
-        <w:rPr>
-          <w:rFonts w:ascii="Calibri" w:hAnsi="Calibri" w:cs="Calibri"/>
-          <w:sz w:val="20"/>
-          <w:szCs w:val="20"/>
-          <w:lang w:val="en-US"/>
-        </w:rPr>
-        <w:t>tablas</w:t>
-      </w:r>
-      <w:proofErr w:type="spellEnd"/>
-      <w:r>
-        <w:rPr>
-          <w:rFonts w:ascii="Calibri" w:hAnsi="Calibri" w:cs="Calibri"/>
-          <w:sz w:val="20"/>
-          <w:szCs w:val="20"/>
-          <w:lang w:val="en-US"/>
-        </w:rPr>
-        <w:t xml:space="preserve"> users, settings, </w:t>
-      </w:r>
-      <w:proofErr w:type="spellStart"/>
-      <w:r>
-        <w:rPr>
-          <w:rFonts w:ascii="Calibri" w:hAnsi="Calibri" w:cs="Calibri"/>
-          <w:sz w:val="20"/>
-          <w:szCs w:val="20"/>
-          <w:lang w:val="en-US"/>
-        </w:rPr>
-        <w:t>usage_sessions</w:t>
-      </w:r>
-      <w:proofErr w:type="spellEnd"/>
-      <w:r>
-        <w:rPr>
-          <w:rFonts w:ascii="Calibri" w:hAnsi="Calibri" w:cs="Calibri"/>
-          <w:sz w:val="20"/>
-          <w:szCs w:val="20"/>
-          <w:lang w:val="en-US"/>
-        </w:rPr>
-        <w:t xml:space="preserve">, </w:t>
-      </w:r>
-      <w:proofErr w:type="gramStart"/>
-      <w:r>
-        <w:rPr>
-          <w:rFonts w:ascii="Calibri" w:hAnsi="Calibri" w:cs="Calibri"/>
-          <w:sz w:val="20"/>
-          <w:szCs w:val="20"/>
-          <w:lang w:val="en-US"/>
-        </w:rPr>
-        <w:t>breaks, macros</w:t>
-      </w:r>
-      <w:proofErr w:type="gramEnd"/>
-      <w:r>
-        <w:rPr>
-          <w:rFonts w:ascii="Calibri" w:hAnsi="Calibri" w:cs="Calibri"/>
-          <w:sz w:val="20"/>
-          <w:szCs w:val="20"/>
-          <w:lang w:val="en-US"/>
-        </w:rPr>
-        <w:t xml:space="preserve">, </w:t>
-      </w:r>
-      <w:proofErr w:type="spellStart"/>
-      <w:r>
-        <w:rPr>
-          <w:rFonts w:ascii="Calibri" w:hAnsi="Calibri" w:cs="Calibri"/>
-          <w:sz w:val="20"/>
-          <w:szCs w:val="20"/>
-          <w:lang w:val="en-US"/>
-        </w:rPr>
-        <w:t>macro_triggers</w:t>
-      </w:r>
-      <w:proofErr w:type="spellEnd"/>
-      <w:r>
-        <w:rPr>
-          <w:rFonts w:ascii="Calibri" w:hAnsi="Calibri" w:cs="Calibri"/>
-          <w:sz w:val="20"/>
-          <w:szCs w:val="20"/>
-          <w:lang w:val="en-US"/>
-        </w:rPr>
-        <w:t xml:space="preserve">, </w:t>
-      </w:r>
-      <w:proofErr w:type="spellStart"/>
-      <w:r>
-        <w:rPr>
-          <w:rFonts w:ascii="Calibri" w:hAnsi="Calibri" w:cs="Calibri"/>
-          <w:sz w:val="20"/>
-          <w:szCs w:val="20"/>
-          <w:lang w:val="en-US"/>
-        </w:rPr>
-        <w:t>macro_actions</w:t>
-      </w:r>
-      <w:proofErr w:type="spellEnd"/>
-      <w:r>
-        <w:rPr>
-          <w:rFonts w:ascii="Calibri" w:hAnsi="Calibri" w:cs="Calibri"/>
-          <w:sz w:val="20"/>
-          <w:szCs w:val="20"/>
-          <w:lang w:val="en-US"/>
-        </w:rPr>
-        <w:t xml:space="preserve"> y applications.</w:t>
+        <w:t xml:space="preserve">Se crean las tablas users, settings, usage_sessions, breaks, macros, macro_triggers, macro_actions y applications.</w:t>
       </w:r>
     </w:p>
     <w:p>
@@ -3913,25 +2632,7 @@
           <w:sz w:val="20"/>
           <w:szCs w:val="20"/>
         </w:rPr>
-        <w:t xml:space="preserve">La restricción de unicidad sobre </w:t>
-      </w:r>
-      <w:proofErr w:type="spellStart"/>
-      <w:r>
-        <w:rPr>
-          <w:rFonts w:ascii="Calibri" w:hAnsi="Calibri" w:cs="Calibri"/>
-          <w:sz w:val="20"/>
-          <w:szCs w:val="20"/>
-        </w:rPr>
-        <w:t>settings.user_id</w:t>
-      </w:r>
-      <w:proofErr w:type="spellEnd"/>
-      <w:r>
-        <w:rPr>
-          <w:rFonts w:ascii="Calibri" w:hAnsi="Calibri" w:cs="Calibri"/>
-          <w:sz w:val="20"/>
-          <w:szCs w:val="20"/>
-        </w:rPr>
-        <w:t xml:space="preserve"> asegura una única configuración por usuario.</w:t>
+        <w:t xml:space="preserve">La restricción de unicidad sobre settings.user_id asegura una única configuración por usuario.</w:t>
       </w:r>
     </w:p>
     <w:p>
@@ -4032,25 +2733,7 @@
           <w:sz w:val="20"/>
           <w:szCs w:val="20"/>
         </w:rPr>
-        <w:t xml:space="preserve">El usuario deberá poder crear una cuenta indicando su nombre, correo electrónico y contraseña. La cuenta se registrará en el servidor de </w:t>
-      </w:r>
-      <w:proofErr w:type="spellStart"/>
-      <w:r>
-        <w:rPr>
-          <w:rFonts w:ascii="Calibri" w:hAnsi="Calibri" w:cs="Calibri"/>
-          <w:sz w:val="20"/>
-          <w:szCs w:val="20"/>
-        </w:rPr>
-        <w:t>ErgoSense</w:t>
-      </w:r>
-      <w:proofErr w:type="spellEnd"/>
-      <w:r>
-        <w:rPr>
-          <w:rFonts w:ascii="Calibri" w:hAnsi="Calibri" w:cs="Calibri"/>
-          <w:sz w:val="20"/>
-          <w:szCs w:val="20"/>
-        </w:rPr>
-        <w:t xml:space="preserve"> y a ella se asociarán su configuración, sesiones de uso, macros y aplicaciones.</w:t>
+        <w:t xml:space="preserve">El usuario deberá poder crear una cuenta indicando su nombre, correo electrónico y contraseña. La cuenta se registrará en el servidor de ErgoSense y a ella se asociarán su configuración, sesiones de uso, macros y aplicaciones.</w:t>
       </w:r>
     </w:p>
     <w:p>
@@ -4107,43 +2790,7 @@
           <w:sz w:val="20"/>
           <w:szCs w:val="20"/>
         </w:rPr>
-        <w:t xml:space="preserve">El usuario podrá crear su cuenta desde una ventana básica de registro, y esta quedará almacenada en la tabla </w:t>
-      </w:r>
-      <w:proofErr w:type="spellStart"/>
-      <w:r>
-        <w:rPr>
-          <w:rFonts w:ascii="Calibri" w:hAnsi="Calibri" w:cs="Calibri"/>
-          <w:sz w:val="20"/>
-          <w:szCs w:val="20"/>
-        </w:rPr>
-        <w:t>users</w:t>
-      </w:r>
-      <w:proofErr w:type="spellEnd"/>
-      <w:r>
-        <w:rPr>
-          <w:rFonts w:ascii="Calibri" w:hAnsi="Calibri" w:cs="Calibri"/>
-          <w:sz w:val="20"/>
-          <w:szCs w:val="20"/>
-        </w:rPr>
-        <w:t xml:space="preserve">, con su configuración inicial en la tabla </w:t>
-      </w:r>
-      <w:proofErr w:type="spellStart"/>
-      <w:r>
-        <w:rPr>
-          <w:rFonts w:ascii="Calibri" w:hAnsi="Calibri" w:cs="Calibri"/>
-          <w:sz w:val="20"/>
-          <w:szCs w:val="20"/>
-        </w:rPr>
-        <w:t>settings</w:t>
-      </w:r>
-      <w:proofErr w:type="spellEnd"/>
-      <w:r>
-        <w:rPr>
-          <w:rFonts w:ascii="Calibri" w:hAnsi="Calibri" w:cs="Calibri"/>
-          <w:sz w:val="20"/>
-          <w:szCs w:val="20"/>
-        </w:rPr>
-        <w:t>.</w:t>
+        <w:t xml:space="preserve">El usuario podrá crear su cuenta desde una ventana básica de registro, y esta quedará almacenada en la tabla users, con su configuración inicial en la tabla settings.</w:t>
       </w:r>
     </w:p>
     <w:p>
@@ -4387,25 +3034,7 @@
           <w:sz w:val="20"/>
           <w:szCs w:val="20"/>
         </w:rPr>
-        <w:t xml:space="preserve">Cada vez que se inicie el monitoreo se creará un registro en </w:t>
-      </w:r>
-      <w:proofErr w:type="spellStart"/>
-      <w:r>
-        <w:rPr>
-          <w:rFonts w:ascii="Calibri" w:hAnsi="Calibri" w:cs="Calibri"/>
-          <w:sz w:val="20"/>
-          <w:szCs w:val="20"/>
-        </w:rPr>
-        <w:t>usage_sessions</w:t>
-      </w:r>
-      <w:proofErr w:type="spellEnd"/>
-      <w:r>
-        <w:rPr>
-          <w:rFonts w:ascii="Calibri" w:hAnsi="Calibri" w:cs="Calibri"/>
-          <w:sz w:val="20"/>
-          <w:szCs w:val="20"/>
-        </w:rPr>
-        <w:t>, que se completará con su hora de término al finalizar el monitoreo o cerrar la aplicación.</w:t>
+        <w:t xml:space="preserve">Cada vez que se inicie el monitoreo se creará un registro en usage_sessions, que se completará con su hora de término al finalizar el monitoreo o cerrar la aplicación.</w:t>
       </w:r>
     </w:p>
     <w:p>
@@ -4470,25 +3099,7 @@
           <w:sz w:val="20"/>
           <w:szCs w:val="20"/>
         </w:rPr>
-        <w:t xml:space="preserve">Cada sesión queda asociada al usuario mediante </w:t>
-      </w:r>
-      <w:proofErr w:type="spellStart"/>
-      <w:r>
-        <w:rPr>
-          <w:rFonts w:ascii="Calibri" w:hAnsi="Calibri" w:cs="Calibri"/>
-          <w:sz w:val="20"/>
-          <w:szCs w:val="20"/>
-        </w:rPr>
-        <w:t>user_id</w:t>
-      </w:r>
-      <w:proofErr w:type="spellEnd"/>
-      <w:r>
-        <w:rPr>
-          <w:rFonts w:ascii="Calibri" w:hAnsi="Calibri" w:cs="Calibri"/>
-          <w:sz w:val="20"/>
-          <w:szCs w:val="20"/>
-        </w:rPr>
-        <w:t>.</w:t>
+        <w:t xml:space="preserve">Cada sesión queda asociada al usuario mediante user_id.</w:t>
       </w:r>
     </w:p>
     <w:p>
@@ -4646,61 +3257,7 @@
           <w:sz w:val="20"/>
           <w:szCs w:val="20"/>
         </w:rPr>
-        <w:t xml:space="preserve">Cuando el usuario deje de interactuar con el teclado y el </w:t>
-      </w:r>
-      <w:proofErr w:type="gramStart"/>
-      <w:r>
-        <w:rPr>
-          <w:rFonts w:ascii="Calibri" w:hAnsi="Calibri" w:cs="Calibri"/>
-          <w:sz w:val="20"/>
-          <w:szCs w:val="20"/>
-        </w:rPr>
-        <w:t>mouse</w:t>
-      </w:r>
-      <w:proofErr w:type="gramEnd"/>
-      <w:r>
-        <w:rPr>
-          <w:rFonts w:ascii="Calibri" w:hAnsi="Calibri" w:cs="Calibri"/>
-          <w:sz w:val="20"/>
-          <w:szCs w:val="20"/>
-        </w:rPr>
-        <w:t xml:space="preserve"> durante el tiempo configurado, </w:t>
-      </w:r>
-      <w:proofErr w:type="spellStart"/>
-      <w:r>
-        <w:rPr>
-          <w:rFonts w:ascii="Calibri" w:hAnsi="Calibri" w:cs="Calibri"/>
-          <w:sz w:val="20"/>
-          <w:szCs w:val="20"/>
-        </w:rPr>
-        <w:t>ErgoSense</w:t>
-      </w:r>
-      <w:proofErr w:type="spellEnd"/>
-      <w:r>
-        <w:rPr>
-          <w:rFonts w:ascii="Calibri" w:hAnsi="Calibri" w:cs="Calibri"/>
-          <w:sz w:val="20"/>
-          <w:szCs w:val="20"/>
-        </w:rPr>
-        <w:t xml:space="preserve"> registrará una pausa en la tabla </w:t>
-      </w:r>
-      <w:proofErr w:type="spellStart"/>
-      <w:r>
-        <w:rPr>
-          <w:rFonts w:ascii="Calibri" w:hAnsi="Calibri" w:cs="Calibri"/>
-          <w:sz w:val="20"/>
-          <w:szCs w:val="20"/>
-        </w:rPr>
-        <w:t>breaks</w:t>
-      </w:r>
-      <w:proofErr w:type="spellEnd"/>
-      <w:r>
-        <w:rPr>
-          <w:rFonts w:ascii="Calibri" w:hAnsi="Calibri" w:cs="Calibri"/>
-          <w:sz w:val="20"/>
-          <w:szCs w:val="20"/>
-        </w:rPr>
-        <w:t>, asociada a la sesión en curso, con su hora de inicio y, al retomar la actividad, con su hora de término.</w:t>
+        <w:t xml:space="preserve">Cuando el usuario deje de interactuar con el teclado y el mouse durante el tiempo configurado, ErgoSense registrará una pausa en la tabla breaks, asociada a la sesión en curso, con su hora de inicio y, al retomar la actividad, con su hora de término.</w:t>
       </w:r>
     </w:p>
     <w:p>
@@ -4765,25 +3322,7 @@
           <w:sz w:val="20"/>
           <w:szCs w:val="20"/>
         </w:rPr>
-        <w:t>El tiempo de inactividad se obtiene de la configuración del usuario (</w:t>
-      </w:r>
-      <w:proofErr w:type="spellStart"/>
-      <w:r>
-        <w:rPr>
-          <w:rFonts w:ascii="Calibri" w:hAnsi="Calibri" w:cs="Calibri"/>
-          <w:sz w:val="20"/>
-          <w:szCs w:val="20"/>
-        </w:rPr>
-        <w:t>inactivity_break_minutes</w:t>
-      </w:r>
-      <w:proofErr w:type="spellEnd"/>
-      <w:r>
-        <w:rPr>
-          <w:rFonts w:ascii="Calibri" w:hAnsi="Calibri" w:cs="Calibri"/>
-          <w:sz w:val="20"/>
-          <w:szCs w:val="20"/>
-        </w:rPr>
-        <w:t>), cuyo valor por defecto es de 10 minutos.</w:t>
+        <w:t>El tiempo de inactividad se obtiene de la configuración del usuario (inactivity_break_minutes), cuyo valor por defecto es de 10 minutos.</w:t>
       </w:r>
     </w:p>
     <w:p>
@@ -5089,16 +3628,8 @@
         <w:rPr>
           <w:rFonts w:ascii="Calibri" w:hAnsi="Calibri" w:cs="Calibri"/>
         </w:rPr>
-        <w:t xml:space="preserve">PB-49 – Implementar servidor de </w:t>
-      </w:r>
-      <w:proofErr w:type="spellStart"/>
-      <w:r>
-        <w:rPr>
-          <w:rFonts w:ascii="Calibri" w:hAnsi="Calibri" w:cs="Calibri"/>
-        </w:rPr>
-        <w:t>ErgoSense</w:t>
-      </w:r>
-      <w:proofErr w:type="spellEnd"/>
+        <w:t xml:space="preserve">PB-49 – Implementar servidor de ErgoSense</w:t>
+      </w:r>
     </w:p>
     <w:p>
       <w:pPr>
@@ -5136,25 +3667,7 @@
           <w:sz w:val="20"/>
           <w:szCs w:val="20"/>
         </w:rPr>
-        <w:t xml:space="preserve">Se deberá desarrollar el servidor de </w:t>
-      </w:r>
-      <w:proofErr w:type="spellStart"/>
-      <w:r>
-        <w:rPr>
-          <w:rFonts w:ascii="Calibri" w:hAnsi="Calibri" w:cs="Calibri"/>
-          <w:sz w:val="20"/>
-          <w:szCs w:val="20"/>
-        </w:rPr>
-        <w:t>ErgoSense</w:t>
-      </w:r>
-      <w:proofErr w:type="spellEnd"/>
-      <w:r>
-        <w:rPr>
-          <w:rFonts w:ascii="Calibri" w:hAnsi="Calibri" w:cs="Calibri"/>
-          <w:sz w:val="20"/>
-          <w:szCs w:val="20"/>
-        </w:rPr>
-        <w:t>, compuesto por una API REST propia y la base de datos PostgreSQL, ambos ejecutados en contenedores Docker. La aplicación de escritorio almacenará y consultará toda su información a través de la API.</w:t>
+        <w:t xml:space="preserve">Se deberá desarrollar el servidor de ErgoSense, compuesto por una API REST propia y la base de datos PostgreSQL, ambos ejecutados en contenedores Docker. La aplicación de escritorio almacenará y consultará toda su información a través de la API.</w:t>
       </w:r>
     </w:p>
     <w:p>
@@ -5193,25 +3706,7 @@
           <w:sz w:val="20"/>
           <w:szCs w:val="20"/>
         </w:rPr>
-        <w:t xml:space="preserve">El servidor podrá levantarse mediante Docker y expondrá los servicios de registro, inicio de sesión y almacenamiento de la información de </w:t>
-      </w:r>
-      <w:proofErr w:type="spellStart"/>
-      <w:r>
-        <w:rPr>
-          <w:rFonts w:ascii="Calibri" w:hAnsi="Calibri" w:cs="Calibri"/>
-          <w:sz w:val="20"/>
-          <w:szCs w:val="20"/>
-        </w:rPr>
-        <w:t>ErgoSense</w:t>
-      </w:r>
-      <w:proofErr w:type="spellEnd"/>
-      <w:r>
-        <w:rPr>
-          <w:rFonts w:ascii="Calibri" w:hAnsi="Calibri" w:cs="Calibri"/>
-          <w:sz w:val="20"/>
-          <w:szCs w:val="20"/>
-        </w:rPr>
-        <w:t>.</w:t>
+        <w:t xml:space="preserve">El servidor podrá levantarse mediante Docker y expondrá los servicios de registro, inicio de sesión y almacenamiento de la información de ErgoSense.</w:t>
       </w:r>
     </w:p>
     <w:p>
@@ -5388,43 +3883,7 @@
           <w:sz w:val="20"/>
           <w:szCs w:val="20"/>
         </w:rPr>
-        <w:t xml:space="preserve">Los </w:t>
-      </w:r>
-      <w:proofErr w:type="spellStart"/>
-      <w:r>
-        <w:rPr>
-          <w:rFonts w:ascii="Calibri" w:hAnsi="Calibri" w:cs="Calibri"/>
-          <w:sz w:val="20"/>
-          <w:szCs w:val="20"/>
-        </w:rPr>
-        <w:t>Product</w:t>
-      </w:r>
-      <w:proofErr w:type="spellEnd"/>
-      <w:r>
-        <w:rPr>
-          <w:rFonts w:ascii="Calibri" w:hAnsi="Calibri" w:cs="Calibri"/>
-          <w:sz w:val="20"/>
-          <w:szCs w:val="20"/>
-        </w:rPr>
-        <w:t xml:space="preserve"> Backlog </w:t>
-      </w:r>
-      <w:proofErr w:type="spellStart"/>
-      <w:r>
-        <w:rPr>
-          <w:rFonts w:ascii="Calibri" w:hAnsi="Calibri" w:cs="Calibri"/>
-          <w:sz w:val="20"/>
-          <w:szCs w:val="20"/>
-        </w:rPr>
-        <w:t>Items</w:t>
-      </w:r>
-      <w:proofErr w:type="spellEnd"/>
-      <w:r>
-        <w:rPr>
-          <w:rFonts w:ascii="Calibri" w:hAnsi="Calibri" w:cs="Calibri"/>
-          <w:sz w:val="20"/>
-          <w:szCs w:val="20"/>
-        </w:rPr>
-        <w:t xml:space="preserve"> seleccionados se descomponen en las siguientes tareas:</w:t>
+        <w:t xml:space="preserve">Los Product Backlog Items seleccionados se descomponen en las siguientes tareas:</w:t>
       </w:r>
     </w:p>
     <w:tbl>
@@ -5676,25 +4135,7 @@
                 <w:sz w:val="20"/>
                 <w:szCs w:val="20"/>
               </w:rPr>
-              <w:t xml:space="preserve">Revisar las tablas, campos, restricciones y relaciones definidas en el </w:t>
-            </w:r>
-            <w:proofErr w:type="spellStart"/>
-            <w:r>
-              <w:rPr>
-                <w:rFonts w:ascii="Calibri" w:hAnsi="Calibri" w:cs="Calibri"/>
-                <w:sz w:val="20"/>
-                <w:szCs w:val="20"/>
-              </w:rPr>
-              <w:t>Product</w:t>
-            </w:r>
-            <w:proofErr w:type="spellEnd"/>
-            <w:r>
-              <w:rPr>
-                <w:rFonts w:ascii="Calibri" w:hAnsi="Calibri" w:cs="Calibri"/>
-                <w:sz w:val="20"/>
-                <w:szCs w:val="20"/>
-              </w:rPr>
-              <w:t xml:space="preserve"> Backlog.</w:t>
+              <w:t xml:space="preserve">Revisar las tablas, campos, restricciones y relaciones definidas en el Product Backlog.</w:t>
             </w:r>
           </w:p>
         </w:tc>
@@ -5814,25 +4255,7 @@
                 <w:sz w:val="20"/>
                 <w:szCs w:val="20"/>
               </w:rPr>
-              <w:t xml:space="preserve">Configurar PostgreSQL en un contenedor Docker para el servidor de </w:t>
-            </w:r>
-            <w:proofErr w:type="spellStart"/>
-            <w:r>
-              <w:rPr>
-                <w:rFonts w:ascii="Calibri" w:hAnsi="Calibri" w:cs="Calibri"/>
-                <w:sz w:val="20"/>
-                <w:szCs w:val="20"/>
-              </w:rPr>
-              <w:t>ErgoSense</w:t>
-            </w:r>
-            <w:proofErr w:type="spellEnd"/>
-            <w:r>
-              <w:rPr>
-                <w:rFonts w:ascii="Calibri" w:hAnsi="Calibri" w:cs="Calibri"/>
-                <w:sz w:val="20"/>
-                <w:szCs w:val="20"/>
-              </w:rPr>
-              <w:t>.</w:t>
+              <w:t xml:space="preserve">Configurar PostgreSQL en un contenedor Docker para el servidor de ErgoSense.</w:t>
             </w:r>
           </w:p>
         </w:tc>
@@ -5952,43 +4375,7 @@
                 <w:sz w:val="20"/>
                 <w:szCs w:val="20"/>
               </w:rPr>
-              <w:t xml:space="preserve">Implementar </w:t>
-            </w:r>
-            <w:proofErr w:type="spellStart"/>
-            <w:r>
-              <w:rPr>
-                <w:rFonts w:ascii="Calibri" w:hAnsi="Calibri" w:cs="Calibri"/>
-                <w:sz w:val="20"/>
-                <w:szCs w:val="20"/>
-              </w:rPr>
-              <w:t>users</w:t>
-            </w:r>
-            <w:proofErr w:type="spellEnd"/>
-            <w:r>
-              <w:rPr>
-                <w:rFonts w:ascii="Calibri" w:hAnsi="Calibri" w:cs="Calibri"/>
-                <w:sz w:val="20"/>
-                <w:szCs w:val="20"/>
-              </w:rPr>
-              <w:t xml:space="preserve"> y </w:t>
-            </w:r>
-            <w:proofErr w:type="spellStart"/>
-            <w:r>
-              <w:rPr>
-                <w:rFonts w:ascii="Calibri" w:hAnsi="Calibri" w:cs="Calibri"/>
-                <w:sz w:val="20"/>
-                <w:szCs w:val="20"/>
-              </w:rPr>
-              <w:t>settings</w:t>
-            </w:r>
-            <w:proofErr w:type="spellEnd"/>
-            <w:r>
-              <w:rPr>
-                <w:rFonts w:ascii="Calibri" w:hAnsi="Calibri" w:cs="Calibri"/>
-                <w:sz w:val="20"/>
-                <w:szCs w:val="20"/>
-              </w:rPr>
-              <w:t xml:space="preserve"> con sus restricciones y valores por defecto.</w:t>
+              <w:t xml:space="preserve">Implementar users y settings con sus restricciones y valores por defecto.</w:t>
             </w:r>
           </w:p>
         </w:tc>
@@ -6108,43 +4495,7 @@
                 <w:sz w:val="20"/>
                 <w:szCs w:val="20"/>
               </w:rPr>
-              <w:t xml:space="preserve">Implementar </w:t>
-            </w:r>
-            <w:proofErr w:type="spellStart"/>
-            <w:r>
-              <w:rPr>
-                <w:rFonts w:ascii="Calibri" w:hAnsi="Calibri" w:cs="Calibri"/>
-                <w:sz w:val="20"/>
-                <w:szCs w:val="20"/>
-              </w:rPr>
-              <w:t>usage_sessions</w:t>
-            </w:r>
-            <w:proofErr w:type="spellEnd"/>
-            <w:r>
-              <w:rPr>
-                <w:rFonts w:ascii="Calibri" w:hAnsi="Calibri" w:cs="Calibri"/>
-                <w:sz w:val="20"/>
-                <w:szCs w:val="20"/>
-              </w:rPr>
-              <w:t xml:space="preserve"> y </w:t>
-            </w:r>
-            <w:proofErr w:type="spellStart"/>
-            <w:r>
-              <w:rPr>
-                <w:rFonts w:ascii="Calibri" w:hAnsi="Calibri" w:cs="Calibri"/>
-                <w:sz w:val="20"/>
-                <w:szCs w:val="20"/>
-              </w:rPr>
-              <w:t>breaks</w:t>
-            </w:r>
-            <w:proofErr w:type="spellEnd"/>
-            <w:r>
-              <w:rPr>
-                <w:rFonts w:ascii="Calibri" w:hAnsi="Calibri" w:cs="Calibri"/>
-                <w:sz w:val="20"/>
-                <w:szCs w:val="20"/>
-              </w:rPr>
-              <w:t xml:space="preserve"> con sus claves foráneas.</w:t>
+              <w:t xml:space="preserve">Implementar usage_sessions y breaks con sus claves foráneas.</w:t>
             </w:r>
           </w:p>
         </w:tc>
@@ -6264,61 +4615,7 @@
                 <w:sz w:val="20"/>
                 <w:szCs w:val="20"/>
               </w:rPr>
-              <w:t xml:space="preserve">Implementar macros, </w:t>
-            </w:r>
-            <w:proofErr w:type="spellStart"/>
-            <w:r>
-              <w:rPr>
-                <w:rFonts w:ascii="Calibri" w:hAnsi="Calibri" w:cs="Calibri"/>
-                <w:sz w:val="20"/>
-                <w:szCs w:val="20"/>
-              </w:rPr>
-              <w:t>macro_triggers</w:t>
-            </w:r>
-            <w:proofErr w:type="spellEnd"/>
-            <w:r>
-              <w:rPr>
-                <w:rFonts w:ascii="Calibri" w:hAnsi="Calibri" w:cs="Calibri"/>
-                <w:sz w:val="20"/>
-                <w:szCs w:val="20"/>
-              </w:rPr>
-              <w:t xml:space="preserve">, </w:t>
-            </w:r>
-            <w:proofErr w:type="spellStart"/>
-            <w:r>
-              <w:rPr>
-                <w:rFonts w:ascii="Calibri" w:hAnsi="Calibri" w:cs="Calibri"/>
-                <w:sz w:val="20"/>
-                <w:szCs w:val="20"/>
-              </w:rPr>
-              <w:t>macro_actions</w:t>
-            </w:r>
-            <w:proofErr w:type="spellEnd"/>
-            <w:r>
-              <w:rPr>
-                <w:rFonts w:ascii="Calibri" w:hAnsi="Calibri" w:cs="Calibri"/>
-                <w:sz w:val="20"/>
-                <w:szCs w:val="20"/>
-              </w:rPr>
-              <w:t xml:space="preserve"> y </w:t>
-            </w:r>
-            <w:proofErr w:type="spellStart"/>
-            <w:r>
-              <w:rPr>
-                <w:rFonts w:ascii="Calibri" w:hAnsi="Calibri" w:cs="Calibri"/>
-                <w:sz w:val="20"/>
-                <w:szCs w:val="20"/>
-              </w:rPr>
-              <w:t>applications</w:t>
-            </w:r>
-            <w:proofErr w:type="spellEnd"/>
-            <w:r>
-              <w:rPr>
-                <w:rFonts w:ascii="Calibri" w:hAnsi="Calibri" w:cs="Calibri"/>
-                <w:sz w:val="20"/>
-                <w:szCs w:val="20"/>
-              </w:rPr>
-              <w:t xml:space="preserve"> para dejar el modelo completo.</w:t>
+              <w:t xml:space="preserve">Implementar macros, macro_triggers, macro_actions y applications para dejar el modelo completo.</w:t>
             </w:r>
           </w:p>
         </w:tc>
@@ -6559,25 +4856,7 @@
                 <w:sz w:val="20"/>
                 <w:szCs w:val="20"/>
               </w:rPr>
-              <w:t xml:space="preserve">Desarrollar las operaciones de lectura y escritura que expondrá la API para los módulos de </w:t>
-            </w:r>
-            <w:proofErr w:type="spellStart"/>
-            <w:r>
-              <w:rPr>
-                <w:rFonts w:ascii="Calibri" w:hAnsi="Calibri" w:cs="Calibri"/>
-                <w:sz w:val="20"/>
-                <w:szCs w:val="20"/>
-              </w:rPr>
-              <w:t>ErgoSense</w:t>
-            </w:r>
-            <w:proofErr w:type="spellEnd"/>
-            <w:r>
-              <w:rPr>
-                <w:rFonts w:ascii="Calibri" w:hAnsi="Calibri" w:cs="Calibri"/>
-                <w:sz w:val="20"/>
-                <w:szCs w:val="20"/>
-              </w:rPr>
-              <w:t>.</w:t>
+              <w:t xml:space="preserve">Desarrollar las operaciones de lectura y escritura que expondrá la API para los módulos de ErgoSense.</w:t>
             </w:r>
           </w:p>
         </w:tc>
@@ -7777,25 +6056,7 @@
                 <w:sz w:val="20"/>
                 <w:szCs w:val="20"/>
               </w:rPr>
-              <w:t xml:space="preserve">Utilizar la actividad de teclado y </w:t>
-            </w:r>
-            <w:proofErr w:type="gramStart"/>
-            <w:r>
-              <w:rPr>
-                <w:rFonts w:ascii="Calibri" w:hAnsi="Calibri" w:cs="Calibri"/>
-                <w:sz w:val="20"/>
-                <w:szCs w:val="20"/>
-              </w:rPr>
-              <w:t>mouse</w:t>
-            </w:r>
-            <w:proofErr w:type="gramEnd"/>
-            <w:r>
-              <w:rPr>
-                <w:rFonts w:ascii="Calibri" w:hAnsi="Calibri" w:cs="Calibri"/>
-                <w:sz w:val="20"/>
-                <w:szCs w:val="20"/>
-              </w:rPr>
-              <w:t xml:space="preserve"> del Sprint 01 para identificar períodos sin interacción.</w:t>
+              <w:t xml:space="preserve">Utilizar la actividad de teclado y mouse del Sprint 01 para identificar períodos sin interacción.</w:t>
             </w:r>
           </w:p>
         </w:tc>
@@ -7915,25 +6176,7 @@
                 <w:sz w:val="20"/>
                 <w:szCs w:val="20"/>
               </w:rPr>
-              <w:t xml:space="preserve">Leer </w:t>
-            </w:r>
-            <w:proofErr w:type="spellStart"/>
-            <w:r>
-              <w:rPr>
-                <w:rFonts w:ascii="Calibri" w:hAnsi="Calibri" w:cs="Calibri"/>
-                <w:sz w:val="20"/>
-                <w:szCs w:val="20"/>
-              </w:rPr>
-              <w:t>inactivity_break_minutes</w:t>
-            </w:r>
-            <w:proofErr w:type="spellEnd"/>
-            <w:r>
-              <w:rPr>
-                <w:rFonts w:ascii="Calibri" w:hAnsi="Calibri" w:cs="Calibri"/>
-                <w:sz w:val="20"/>
-                <w:szCs w:val="20"/>
-              </w:rPr>
-              <w:t xml:space="preserve"> desde la configuración para determinar cuándo existe una pausa.</w:t>
+              <w:t xml:space="preserve">Leer inactivity_break_minutes desde la configuración para determinar cuándo existe una pausa.</w:t>
             </w:r>
           </w:p>
         </w:tc>
@@ -8053,25 +6296,7 @@
                 <w:sz w:val="20"/>
                 <w:szCs w:val="20"/>
               </w:rPr>
-              <w:t xml:space="preserve">Almacenar la pausa en </w:t>
-            </w:r>
-            <w:proofErr w:type="spellStart"/>
-            <w:r>
-              <w:rPr>
-                <w:rFonts w:ascii="Calibri" w:hAnsi="Calibri" w:cs="Calibri"/>
-                <w:sz w:val="20"/>
-                <w:szCs w:val="20"/>
-              </w:rPr>
-              <w:t>breaks</w:t>
-            </w:r>
-            <w:proofErr w:type="spellEnd"/>
-            <w:r>
-              <w:rPr>
-                <w:rFonts w:ascii="Calibri" w:hAnsi="Calibri" w:cs="Calibri"/>
-                <w:sz w:val="20"/>
-                <w:szCs w:val="20"/>
-              </w:rPr>
-              <w:t>, asociada a la sesión en curso.</w:t>
+              <w:t xml:space="preserve">Almacenar la pausa en breaks, asociada a la sesión en curso.</w:t>
             </w:r>
           </w:p>
         </w:tc>
@@ -8523,23 +6748,13 @@
                 <w:szCs w:val="20"/>
               </w:rPr>
             </w:pPr>
-            <w:proofErr w:type="spellStart"/>
-            <w:r>
-              <w:rPr>
-                <w:rFonts w:ascii="Calibri" w:hAnsi="Calibri" w:cs="Calibri"/>
-                <w:sz w:val="20"/>
-                <w:szCs w:val="20"/>
-              </w:rPr>
-              <w:t>Contenerizar</w:t>
-            </w:r>
-            <w:proofErr w:type="spellEnd"/>
-            <w:r>
-              <w:rPr>
-                <w:rFonts w:ascii="Calibri" w:hAnsi="Calibri" w:cs="Calibri"/>
-                <w:sz w:val="20"/>
-                <w:szCs w:val="20"/>
-              </w:rPr>
-              <w:t xml:space="preserve"> el servidor</w:t>
+            <w:r>
+              <w:rPr>
+                <w:rFonts w:ascii="Calibri" w:hAnsi="Calibri" w:cs="Calibri"/>
+                <w:sz w:val="20"/>
+                <w:szCs w:val="20"/>
+              </w:rPr>
+              <w:t xml:space="preserve">Contenerizar el servidor</w:t>
             </w:r>
           </w:p>
         </w:tc>
@@ -9531,25 +7746,7 @@
           <w:sz w:val="20"/>
           <w:szCs w:val="20"/>
         </w:rPr>
-        <w:t xml:space="preserve">El registro de pausas depende además del monitoreo desarrollado en el Sprint 01, que entrega la actividad de teclado y </w:t>
-      </w:r>
-      <w:proofErr w:type="gramStart"/>
-      <w:r>
-        <w:rPr>
-          <w:rFonts w:ascii="Calibri" w:hAnsi="Calibri" w:cs="Calibri"/>
-          <w:sz w:val="20"/>
-          <w:szCs w:val="20"/>
-        </w:rPr>
-        <w:t>mouse</w:t>
-      </w:r>
-      <w:proofErr w:type="gramEnd"/>
-      <w:r>
-        <w:rPr>
-          <w:rFonts w:ascii="Calibri" w:hAnsi="Calibri" w:cs="Calibri"/>
-          <w:sz w:val="20"/>
-          <w:szCs w:val="20"/>
-        </w:rPr>
-        <w:t>, y del tiempo de inactividad almacenado en la configuración que se crea junto con la cuenta. Por este motivo, PB-35 puede desarrollarse en este Sprint sin esperar a PB-36, que permitirá modificar la configuración en el Sprint 03.</w:t>
+        <w:t xml:space="preserve">El registro de pausas depende además del monitoreo desarrollado en el Sprint 01, que entrega la actividad de teclado y mouse, y del tiempo de inactividad almacenado en la configuración que se crea junto con la cuenta. Por este motivo, PB-35 puede desarrollarse en este Sprint sin esperar a PB-36, que permitirá modificar la configuración en el Sprint 03.</w:t>
       </w:r>
     </w:p>
     <w:p>
@@ -9645,25 +7842,7 @@
           <w:sz w:val="20"/>
           <w:szCs w:val="20"/>
         </w:rPr>
-        <w:t xml:space="preserve">Se revisará el modelo definido en el </w:t>
-      </w:r>
-      <w:proofErr w:type="spellStart"/>
-      <w:r>
-        <w:rPr>
-          <w:rFonts w:ascii="Calibri" w:hAnsi="Calibri" w:cs="Calibri"/>
-          <w:sz w:val="20"/>
-          <w:szCs w:val="20"/>
-        </w:rPr>
-        <w:t>Product</w:t>
-      </w:r>
-      <w:proofErr w:type="spellEnd"/>
-      <w:r>
-        <w:rPr>
-          <w:rFonts w:ascii="Calibri" w:hAnsi="Calibri" w:cs="Calibri"/>
-          <w:sz w:val="20"/>
-          <w:szCs w:val="20"/>
-        </w:rPr>
-        <w:t xml:space="preserve"> Backlog y se preparará el servidor, con su API y la base de datos PostgreSQL en contenedores Docker.</w:t>
+        <w:t xml:space="preserve">Se revisará el modelo definido en el Product Backlog y se preparará el servidor, con su API y la base de datos PostgreSQL en contenedores Docker.</w:t>
       </w:r>
     </w:p>
     <w:p>
@@ -10262,25 +8441,7 @@
                 <w:sz w:val="20"/>
                 <w:szCs w:val="20"/>
               </w:rPr>
-              <w:t xml:space="preserve">Las claves foráneas, la unicidad de </w:t>
-            </w:r>
-            <w:proofErr w:type="spellStart"/>
-            <w:r>
-              <w:rPr>
-                <w:rFonts w:ascii="Calibri" w:hAnsi="Calibri" w:cs="Calibri"/>
-                <w:sz w:val="20"/>
-                <w:szCs w:val="20"/>
-              </w:rPr>
-              <w:t>settings.user_id</w:t>
-            </w:r>
-            <w:proofErr w:type="spellEnd"/>
-            <w:r>
-              <w:rPr>
-                <w:rFonts w:ascii="Calibri" w:hAnsi="Calibri" w:cs="Calibri"/>
-                <w:sz w:val="20"/>
-                <w:szCs w:val="20"/>
-              </w:rPr>
-              <w:t xml:space="preserve"> y los valores por defecto funcionan según el modelo.</w:t>
+              <w:t xml:space="preserve">Las claves foráneas, la unicidad de settings.user_id y los valores por defecto funcionan según el modelo.</w:t>
             </w:r>
           </w:p>
         </w:tc>
@@ -11535,23 +9696,7 @@
           <w:rFonts w:ascii="Calibri" w:hAnsi="Calibri" w:cs="Calibri"/>
           <w:lang w:val="en-US"/>
         </w:rPr>
-        <w:t xml:space="preserve">9. </w:t>
-      </w:r>
-      <w:proofErr w:type="spellStart"/>
-      <w:r>
-        <w:rPr>
-          <w:rFonts w:ascii="Calibri" w:hAnsi="Calibri" w:cs="Calibri"/>
-          <w:lang w:val="en-US"/>
-        </w:rPr>
-        <w:t>Eventos</w:t>
-      </w:r>
-      <w:proofErr w:type="spellEnd"/>
-      <w:r>
-        <w:rPr>
-          <w:rFonts w:ascii="Calibri" w:hAnsi="Calibri" w:cs="Calibri"/>
-          <w:lang w:val="en-US"/>
-        </w:rPr>
-        <w:t xml:space="preserve"> Scrum del Sprint</w:t>
+        <w:t xml:space="preserve">9. Eventos Scrum del Sprint</w:t>
       </w:r>
       <w:bookmarkEnd w:id="12"/>
     </w:p>
@@ -11593,97 +9738,25 @@
           <w:sz w:val="20"/>
           <w:szCs w:val="20"/>
         </w:rPr>
-        <w:t xml:space="preserve">Durante la Sprint </w:t>
-      </w:r>
-      <w:proofErr w:type="spellStart"/>
-      <w:r>
-        <w:rPr>
-          <w:rFonts w:ascii="Calibri" w:hAnsi="Calibri" w:cs="Calibri"/>
-          <w:sz w:val="20"/>
-          <w:szCs w:val="20"/>
-        </w:rPr>
-        <w:t>Planning</w:t>
-      </w:r>
-      <w:proofErr w:type="spellEnd"/>
-      <w:r>
-        <w:rPr>
-          <w:rFonts w:ascii="Calibri" w:hAnsi="Calibri" w:cs="Calibri"/>
-          <w:sz w:val="20"/>
-          <w:szCs w:val="20"/>
-        </w:rPr>
-        <w:t xml:space="preserve"> se seleccionarán los elementos PB-32 a PB-35, PB-48 y PB-49, y se definirá como Sprint </w:t>
-      </w:r>
-      <w:proofErr w:type="spellStart"/>
-      <w:r>
-        <w:rPr>
-          <w:rFonts w:ascii="Calibri" w:hAnsi="Calibri" w:cs="Calibri"/>
-          <w:sz w:val="20"/>
-          <w:szCs w:val="20"/>
-        </w:rPr>
-        <w:t>Goal</w:t>
-      </w:r>
-      <w:proofErr w:type="spellEnd"/>
-      <w:r>
-        <w:rPr>
-          <w:rFonts w:ascii="Calibri" w:hAnsi="Calibri" w:cs="Calibri"/>
-          <w:sz w:val="20"/>
-          <w:szCs w:val="20"/>
-        </w:rPr>
-        <w:t xml:space="preserve"> la disponibilidad del servidor, las cuentas de usuario y la persistencia de la información.</w:t>
-      </w:r>
-    </w:p>
-    <w:p>
-      <w:pPr>
-        <w:jc w:val="both"/>
-        <w:rPr>
-          <w:rFonts w:ascii="Calibri" w:hAnsi="Calibri" w:cs="Calibri"/>
-          <w:sz w:val="20"/>
-          <w:szCs w:val="20"/>
-        </w:rPr>
-      </w:pPr>
-      <w:r>
-        <w:rPr>
-          <w:rFonts w:ascii="Calibri" w:hAnsi="Calibri" w:cs="Calibri"/>
-          <w:sz w:val="20"/>
-          <w:szCs w:val="20"/>
-        </w:rPr>
-        <w:t xml:space="preserve">También se revisará en conjunto el modelo de datos del </w:t>
-      </w:r>
-      <w:proofErr w:type="spellStart"/>
-      <w:r>
-        <w:rPr>
-          <w:rFonts w:ascii="Calibri" w:hAnsi="Calibri" w:cs="Calibri"/>
-          <w:sz w:val="20"/>
-          <w:szCs w:val="20"/>
-        </w:rPr>
-        <w:t>Product</w:t>
-      </w:r>
-      <w:proofErr w:type="spellEnd"/>
-      <w:r>
-        <w:rPr>
-          <w:rFonts w:ascii="Calibri" w:hAnsi="Calibri" w:cs="Calibri"/>
-          <w:sz w:val="20"/>
-          <w:szCs w:val="20"/>
-        </w:rPr>
-        <w:t xml:space="preserve"> Backlog, ya que será utilizado por todos los </w:t>
-      </w:r>
-      <w:proofErr w:type="spellStart"/>
-      <w:r>
-        <w:rPr>
-          <w:rFonts w:ascii="Calibri" w:hAnsi="Calibri" w:cs="Calibri"/>
-          <w:sz w:val="20"/>
-          <w:szCs w:val="20"/>
-        </w:rPr>
-        <w:t>Sprints</w:t>
-      </w:r>
-      <w:proofErr w:type="spellEnd"/>
-      <w:r>
-        <w:rPr>
-          <w:rFonts w:ascii="Calibri" w:hAnsi="Calibri" w:cs="Calibri"/>
-          <w:sz w:val="20"/>
-          <w:szCs w:val="20"/>
-        </w:rPr>
-        <w:t xml:space="preserve"> siguientes y cualquier ajuste resulta más sencillo en esta etapa.</w:t>
+        <w:t xml:space="preserve">Durante la Sprint Planning se seleccionarán los elementos PB-32 a PB-35, PB-48 y PB-49, y se definirá como Sprint Goal la disponibilidad del servidor, las cuentas de usuario y la persistencia de la información.</w:t>
+      </w:r>
+    </w:p>
+    <w:p>
+      <w:pPr>
+        <w:jc w:val="both"/>
+        <w:rPr>
+          <w:rFonts w:ascii="Calibri" w:hAnsi="Calibri" w:cs="Calibri"/>
+          <w:sz w:val="20"/>
+          <w:szCs w:val="20"/>
+        </w:rPr>
+      </w:pPr>
+      <w:r>
+        <w:rPr>
+          <w:rFonts w:ascii="Calibri" w:hAnsi="Calibri" w:cs="Calibri"/>
+          <w:sz w:val="20"/>
+          <w:szCs w:val="20"/>
+        </w:rPr>
+        <w:t xml:space="preserve">También se revisará en conjunto el modelo de datos del Product Backlog, ya que será utilizado por todos los Sprints siguientes y cualquier ajuste resulta más sencillo en esta etapa.</w:t>
       </w:r>
     </w:p>
     <w:p>
@@ -11722,25 +9795,7 @@
           <w:sz w:val="20"/>
           <w:szCs w:val="20"/>
         </w:rPr>
-        <w:t xml:space="preserve">El Daily Scrum permitirá revisar el avance de las tareas, detectar impedimentos —por ejemplo, ajustes necesarios en las relaciones entre tablas— y reorganizar el trabajo para cumplir el Sprint </w:t>
-      </w:r>
-      <w:proofErr w:type="spellStart"/>
-      <w:r>
-        <w:rPr>
-          <w:rFonts w:ascii="Calibri" w:hAnsi="Calibri" w:cs="Calibri"/>
-          <w:sz w:val="20"/>
-          <w:szCs w:val="20"/>
-        </w:rPr>
-        <w:t>Goal</w:t>
-      </w:r>
-      <w:proofErr w:type="spellEnd"/>
-      <w:r>
-        <w:rPr>
-          <w:rFonts w:ascii="Calibri" w:hAnsi="Calibri" w:cs="Calibri"/>
-          <w:sz w:val="20"/>
-          <w:szCs w:val="20"/>
-        </w:rPr>
-        <w:t>.</w:t>
+        <w:t xml:space="preserve">El Daily Scrum permitirá revisar el avance de las tareas, detectar impedimentos —por ejemplo, ajustes necesarios en las relaciones entre tablas— y reorganizar el trabajo para cumplir el Sprint Goal.</w:t>
       </w:r>
     </w:p>
     <w:p>
@@ -11761,55 +9816,25 @@
           <w:sz w:val="20"/>
           <w:szCs w:val="20"/>
         </w:rPr>
-        <w:t xml:space="preserve">Sprint </w:t>
-      </w:r>
-      <w:proofErr w:type="spellStart"/>
-      <w:r>
-        <w:rPr>
-          <w:rFonts w:ascii="Calibri" w:hAnsi="Calibri" w:cs="Calibri"/>
-          <w:b/>
-          <w:bCs/>
-          <w:sz w:val="20"/>
-          <w:szCs w:val="20"/>
-        </w:rPr>
-        <w:t>Review</w:t>
-      </w:r>
-      <w:proofErr w:type="spellEnd"/>
-    </w:p>
-    <w:p>
-      <w:pPr>
-        <w:jc w:val="both"/>
-        <w:rPr>
-          <w:rFonts w:ascii="Calibri" w:hAnsi="Calibri" w:cs="Calibri"/>
-          <w:sz w:val="20"/>
-          <w:szCs w:val="20"/>
-        </w:rPr>
-      </w:pPr>
-      <w:r>
-        <w:rPr>
-          <w:rFonts w:ascii="Calibri" w:hAnsi="Calibri" w:cs="Calibri"/>
-          <w:sz w:val="20"/>
-          <w:szCs w:val="20"/>
-        </w:rPr>
-        <w:t xml:space="preserve">Durante la Sprint </w:t>
-      </w:r>
-      <w:proofErr w:type="spellStart"/>
-      <w:r>
-        <w:rPr>
-          <w:rFonts w:ascii="Calibri" w:hAnsi="Calibri" w:cs="Calibri"/>
-          <w:sz w:val="20"/>
-          <w:szCs w:val="20"/>
-        </w:rPr>
-        <w:t>Review</w:t>
-      </w:r>
-      <w:proofErr w:type="spellEnd"/>
-      <w:r>
-        <w:rPr>
-          <w:rFonts w:ascii="Calibri" w:hAnsi="Calibri" w:cs="Calibri"/>
-          <w:sz w:val="20"/>
-          <w:szCs w:val="20"/>
-        </w:rPr>
-        <w:t xml:space="preserve"> se espera demostrar:</w:t>
+        <w:t xml:space="preserve">Sprint Review</w:t>
+      </w:r>
+    </w:p>
+    <w:p>
+      <w:pPr>
+        <w:jc w:val="both"/>
+        <w:rPr>
+          <w:rFonts w:ascii="Calibri" w:hAnsi="Calibri" w:cs="Calibri"/>
+          <w:sz w:val="20"/>
+          <w:szCs w:val="20"/>
+        </w:rPr>
+      </w:pPr>
+      <w:r>
+        <w:rPr>
+          <w:rFonts w:ascii="Calibri" w:hAnsi="Calibri" w:cs="Calibri"/>
+          <w:sz w:val="20"/>
+          <w:szCs w:val="20"/>
+        </w:rPr>
+        <w:t xml:space="preserve">Durante la Sprint Review se espera demostrar:</w:t>
       </w:r>
     </w:p>
     <w:p>
@@ -11937,25 +9962,7 @@
           <w:sz w:val="20"/>
           <w:szCs w:val="20"/>
         </w:rPr>
-        <w:t xml:space="preserve">La revisión permitirá comprobar el cumplimiento de los criterios de aceptación y confirmar que el modelo de datos es adecuado para los </w:t>
-      </w:r>
-      <w:proofErr w:type="spellStart"/>
-      <w:r>
-        <w:rPr>
-          <w:rFonts w:ascii="Calibri" w:hAnsi="Calibri" w:cs="Calibri"/>
-          <w:sz w:val="20"/>
-          <w:szCs w:val="20"/>
-        </w:rPr>
-        <w:t>Sprints</w:t>
-      </w:r>
-      <w:proofErr w:type="spellEnd"/>
-      <w:r>
-        <w:rPr>
-          <w:rFonts w:ascii="Calibri" w:hAnsi="Calibri" w:cs="Calibri"/>
-          <w:sz w:val="20"/>
-          <w:szCs w:val="20"/>
-        </w:rPr>
-        <w:t xml:space="preserve"> siguientes.</w:t>
+        <w:t xml:space="preserve">La revisión permitirá comprobar el cumplimiento de los criterios de aceptación y confirmar que el modelo de datos es adecuado para los Sprints siguientes.</w:t>
       </w:r>
     </w:p>
     <w:p>
@@ -12039,35 +10046,7 @@
         <w:rPr>
           <w:rFonts w:ascii="Calibri" w:hAnsi="Calibri" w:cs="Calibri"/>
         </w:rPr>
-        <w:t xml:space="preserve">10. </w:t>
-      </w:r>
-      <w:proofErr w:type="spellStart"/>
-      <w:r>
-        <w:rPr>
-          <w:rFonts w:ascii="Calibri" w:hAnsi="Calibri" w:cs="Calibri"/>
-        </w:rPr>
-        <w:t>Definition</w:t>
-      </w:r>
-      <w:proofErr w:type="spellEnd"/>
-      <w:r>
-        <w:rPr>
-          <w:rFonts w:ascii="Calibri" w:hAnsi="Calibri" w:cs="Calibri"/>
-        </w:rPr>
-        <w:t xml:space="preserve"> </w:t>
-      </w:r>
-      <w:proofErr w:type="spellStart"/>
-      <w:r>
-        <w:rPr>
-          <w:rFonts w:ascii="Calibri" w:hAnsi="Calibri" w:cs="Calibri"/>
-        </w:rPr>
-        <w:t>of</w:t>
-      </w:r>
-      <w:proofErr w:type="spellEnd"/>
-      <w:r>
-        <w:rPr>
-          <w:rFonts w:ascii="Calibri" w:hAnsi="Calibri" w:cs="Calibri"/>
-        </w:rPr>
-        <w:t xml:space="preserve"> Done</w:t>
+        <w:t xml:space="preserve">10. Definition of Done</w:t>
       </w:r>
       <w:bookmarkEnd w:id="13"/>
     </w:p>
@@ -12086,79 +10065,7 @@
           <w:sz w:val="20"/>
           <w:szCs w:val="20"/>
         </w:rPr>
-        <w:t xml:space="preserve">La </w:t>
-      </w:r>
-      <w:proofErr w:type="spellStart"/>
-      <w:r>
-        <w:rPr>
-          <w:rFonts w:ascii="Calibri" w:hAnsi="Calibri" w:cs="Calibri"/>
-          <w:sz w:val="20"/>
-          <w:szCs w:val="20"/>
-        </w:rPr>
-        <w:t>Definition</w:t>
-      </w:r>
-      <w:proofErr w:type="spellEnd"/>
-      <w:r>
-        <w:rPr>
-          <w:rFonts w:ascii="Calibri" w:hAnsi="Calibri" w:cs="Calibri"/>
-          <w:sz w:val="20"/>
-          <w:szCs w:val="20"/>
-        </w:rPr>
-        <w:t xml:space="preserve"> </w:t>
-      </w:r>
-      <w:proofErr w:type="spellStart"/>
-      <w:r>
-        <w:rPr>
-          <w:rFonts w:ascii="Calibri" w:hAnsi="Calibri" w:cs="Calibri"/>
-          <w:sz w:val="20"/>
-          <w:szCs w:val="20"/>
-        </w:rPr>
-        <w:t>of</w:t>
-      </w:r>
-      <w:proofErr w:type="spellEnd"/>
-      <w:r>
-        <w:rPr>
-          <w:rFonts w:ascii="Calibri" w:hAnsi="Calibri" w:cs="Calibri"/>
-          <w:sz w:val="20"/>
-          <w:szCs w:val="20"/>
-        </w:rPr>
-        <w:t xml:space="preserve"> Done es común a todos los </w:t>
-      </w:r>
-      <w:proofErr w:type="spellStart"/>
-      <w:r>
-        <w:rPr>
-          <w:rFonts w:ascii="Calibri" w:hAnsi="Calibri" w:cs="Calibri"/>
-          <w:sz w:val="20"/>
-          <w:szCs w:val="20"/>
-        </w:rPr>
-        <w:t>Sprints</w:t>
-      </w:r>
-      <w:proofErr w:type="spellEnd"/>
-      <w:r>
-        <w:rPr>
-          <w:rFonts w:ascii="Calibri" w:hAnsi="Calibri" w:cs="Calibri"/>
-          <w:sz w:val="20"/>
-          <w:szCs w:val="20"/>
-        </w:rPr>
-        <w:t xml:space="preserve"> de </w:t>
-      </w:r>
-      <w:proofErr w:type="spellStart"/>
-      <w:r>
-        <w:rPr>
-          <w:rFonts w:ascii="Calibri" w:hAnsi="Calibri" w:cs="Calibri"/>
-          <w:sz w:val="20"/>
-          <w:szCs w:val="20"/>
-        </w:rPr>
-        <w:t>ErgoSense</w:t>
-      </w:r>
-      <w:proofErr w:type="spellEnd"/>
-      <w:r>
-        <w:rPr>
-          <w:rFonts w:ascii="Calibri" w:hAnsi="Calibri" w:cs="Calibri"/>
-          <w:sz w:val="20"/>
-          <w:szCs w:val="20"/>
-        </w:rPr>
-        <w:t>. Un elemento del Sprint Backlog será considerado terminado cuando:</w:t>
+        <w:t xml:space="preserve">La Definition of Done es común a todos los Sprints de ErgoSense y se detalla, junto con sus evidencias, en el documento Definition of Done del proyecto. Un elemento del Sprint Backlog será considerado terminado cuando:</w:t>
       </w:r>
     </w:p>
     <w:p>
@@ -12202,25 +10109,7 @@
           <w:sz w:val="20"/>
           <w:szCs w:val="20"/>
         </w:rPr>
-        <w:t xml:space="preserve">Cumpla los criterios de aceptación definidos en el </w:t>
-      </w:r>
-      <w:proofErr w:type="spellStart"/>
-      <w:r>
-        <w:rPr>
-          <w:rFonts w:ascii="Calibri" w:hAnsi="Calibri" w:cs="Calibri"/>
-          <w:sz w:val="20"/>
-          <w:szCs w:val="20"/>
-        </w:rPr>
-        <w:t>Product</w:t>
-      </w:r>
-      <w:proofErr w:type="spellEnd"/>
-      <w:r>
-        <w:rPr>
-          <w:rFonts w:ascii="Calibri" w:hAnsi="Calibri" w:cs="Calibri"/>
-          <w:sz w:val="20"/>
-          <w:szCs w:val="20"/>
-        </w:rPr>
-        <w:t xml:space="preserve"> Backlog y en este documento.</w:t>
+        <w:t xml:space="preserve">Cumpla los criterios de aceptación definidos en el Product Backlog y en este documento.</w:t>
       </w:r>
     </w:p>
     <w:p>
@@ -12330,25 +10219,7 @@
           <w:sz w:val="20"/>
           <w:szCs w:val="20"/>
         </w:rPr>
-        <w:t xml:space="preserve">Pueda ser demostrado durante la Sprint </w:t>
-      </w:r>
-      <w:proofErr w:type="spellStart"/>
-      <w:r>
-        <w:rPr>
-          <w:rFonts w:ascii="Calibri" w:hAnsi="Calibri" w:cs="Calibri"/>
-          <w:sz w:val="20"/>
-          <w:szCs w:val="20"/>
-        </w:rPr>
-        <w:t>Review</w:t>
-      </w:r>
-      <w:proofErr w:type="spellEnd"/>
-      <w:r>
-        <w:rPr>
-          <w:rFonts w:ascii="Calibri" w:hAnsi="Calibri" w:cs="Calibri"/>
-          <w:sz w:val="20"/>
-          <w:szCs w:val="20"/>
-        </w:rPr>
-        <w:t>.</w:t>
+        <w:t xml:space="preserve">Pueda ser demostrado durante la Sprint Review.</w:t>
       </w:r>
     </w:p>
     <w:p>
@@ -12451,43 +10322,7 @@
           <w:sz w:val="20"/>
           <w:szCs w:val="20"/>
         </w:rPr>
-        <w:t xml:space="preserve">El incremento esperado corresponde a una versión de </w:t>
-      </w:r>
-      <w:proofErr w:type="spellStart"/>
-      <w:r>
-        <w:rPr>
-          <w:rFonts w:ascii="Calibri" w:hAnsi="Calibri" w:cs="Calibri"/>
-          <w:sz w:val="20"/>
-          <w:szCs w:val="20"/>
-        </w:rPr>
-        <w:t>ErgoSense</w:t>
-      </w:r>
-      <w:proofErr w:type="spellEnd"/>
-      <w:r>
-        <w:rPr>
-          <w:rFonts w:ascii="Calibri" w:hAnsi="Calibri" w:cs="Calibri"/>
-          <w:sz w:val="20"/>
-          <w:szCs w:val="20"/>
-        </w:rPr>
-        <w:t xml:space="preserve"> que, además de monitorear la actividad y generar el aviso de 60 minutos, conserva la información de uso en el servidor de </w:t>
-      </w:r>
-      <w:proofErr w:type="spellStart"/>
-      <w:r>
-        <w:rPr>
-          <w:rFonts w:ascii="Calibri" w:hAnsi="Calibri" w:cs="Calibri"/>
-          <w:sz w:val="20"/>
-          <w:szCs w:val="20"/>
-        </w:rPr>
-        <w:t>ErgoSense</w:t>
-      </w:r>
-      <w:proofErr w:type="spellEnd"/>
-      <w:r>
-        <w:rPr>
-          <w:rFonts w:ascii="Calibri" w:hAnsi="Calibri" w:cs="Calibri"/>
-          <w:sz w:val="20"/>
-          <w:szCs w:val="20"/>
-        </w:rPr>
-        <w:t>, asociada a la cuenta del usuario. Antes de este Sprint, todo lo registrado se perdía al cerrar la aplicación; al finalizarlo, deberá ser posible el siguiente flujo:</w:t>
+        <w:t xml:space="preserve">El incremento esperado corresponde a una versión de ErgoSense que, además de monitorear la actividad y generar el aviso de 60 minutos, conserva la información de uso en el servidor de ErgoSense, asociada a la cuenta del usuario. Antes de este Sprint, todo lo registrado se perdía al cerrar la aplicación; al finalizarlo, deberá ser posible el siguiente flujo:</w:t>
       </w:r>
     </w:p>
     <w:p>
@@ -12526,25 +10361,7 @@
           <w:szCs w:val="20"/>
         </w:rPr>
         <w:lastRenderedPageBreak/>
-        <w:t xml:space="preserve">La base de datos quedará preparada además para la configuración y las macros que se desarrollarán en los </w:t>
-      </w:r>
-      <w:proofErr w:type="spellStart"/>
-      <w:r>
-        <w:rPr>
-          <w:rFonts w:ascii="Calibri" w:hAnsi="Calibri" w:cs="Calibri"/>
-          <w:sz w:val="20"/>
-          <w:szCs w:val="20"/>
-        </w:rPr>
-        <w:t>Sprints</w:t>
-      </w:r>
-      <w:proofErr w:type="spellEnd"/>
-      <w:r>
-        <w:rPr>
-          <w:rFonts w:ascii="Calibri" w:hAnsi="Calibri" w:cs="Calibri"/>
-          <w:sz w:val="20"/>
-          <w:szCs w:val="20"/>
-        </w:rPr>
-        <w:t xml:space="preserve"> siguientes.</w:t>
+        <w:t xml:space="preserve">La base de datos quedará preparada además para la configuración y las macros que se desarrollarán en los Sprints siguientes.</w:t>
       </w:r>
     </w:p>
     <w:p>
@@ -12931,23 +10748,13 @@
                 <w:szCs w:val="20"/>
               </w:rPr>
             </w:pPr>
-            <w:proofErr w:type="spellStart"/>
-            <w:r>
-              <w:rPr>
-                <w:rFonts w:ascii="Calibri" w:hAnsi="Calibri" w:cs="Calibri"/>
-                <w:sz w:val="20"/>
-                <w:szCs w:val="20"/>
-              </w:rPr>
-              <w:t>Product</w:t>
-            </w:r>
-            <w:proofErr w:type="spellEnd"/>
-            <w:r>
-              <w:rPr>
-                <w:rFonts w:ascii="Calibri" w:hAnsi="Calibri" w:cs="Calibri"/>
-                <w:sz w:val="20"/>
-                <w:szCs w:val="20"/>
-              </w:rPr>
-              <w:t xml:space="preserve"> Vision</w:t>
+            <w:r>
+              <w:rPr>
+                <w:rFonts w:ascii="Calibri" w:hAnsi="Calibri" w:cs="Calibri"/>
+                <w:sz w:val="20"/>
+                <w:szCs w:val="20"/>
+              </w:rPr>
+              <w:t xml:space="preserve">Product Vision</w:t>
             </w:r>
           </w:p>
         </w:tc>
@@ -12994,23 +10801,13 @@
                 <w:szCs w:val="20"/>
               </w:rPr>
             </w:pPr>
-            <w:proofErr w:type="spellStart"/>
-            <w:r>
-              <w:rPr>
-                <w:rFonts w:ascii="Calibri" w:hAnsi="Calibri" w:cs="Calibri"/>
-                <w:sz w:val="20"/>
-                <w:szCs w:val="20"/>
-              </w:rPr>
-              <w:t>Product</w:t>
-            </w:r>
-            <w:proofErr w:type="spellEnd"/>
-            <w:r>
-              <w:rPr>
-                <w:rFonts w:ascii="Calibri" w:hAnsi="Calibri" w:cs="Calibri"/>
-                <w:sz w:val="20"/>
-                <w:szCs w:val="20"/>
-              </w:rPr>
-              <w:t xml:space="preserve"> Backlog</w:t>
+            <w:r>
+              <w:rPr>
+                <w:rFonts w:ascii="Calibri" w:hAnsi="Calibri" w:cs="Calibri"/>
+                <w:sz w:val="20"/>
+                <w:szCs w:val="20"/>
+              </w:rPr>
+              <w:t xml:space="preserve">Product Backlog</w:t>
             </w:r>
           </w:p>
         </w:tc>
@@ -13063,18 +10860,8 @@
                 <w:sz w:val="20"/>
                 <w:szCs w:val="20"/>
               </w:rPr>
-              <w:t xml:space="preserve">Sprint </w:t>
-            </w:r>
-            <w:proofErr w:type="spellStart"/>
-            <w:r>
-              <w:rPr>
-                <w:rFonts w:ascii="Calibri" w:hAnsi="Calibri" w:cs="Calibri"/>
-                <w:sz w:val="20"/>
-                <w:szCs w:val="20"/>
-              </w:rPr>
-              <w:t>Goal</w:t>
-            </w:r>
-            <w:proofErr w:type="spellEnd"/>
+              <w:t xml:space="preserve">Sprint Goal</w:t>
+            </w:r>
           </w:p>
         </w:tc>
         <w:tc>
@@ -13222,25 +11009,7 @@
           <w:sz w:val="20"/>
           <w:szCs w:val="20"/>
         </w:rPr>
-        <w:t xml:space="preserve">La trazabilidad muestra cómo la persistencia se apoya en el monitoreo del Sprint 01 y cómo prepara el trabajo de los </w:t>
-      </w:r>
-      <w:proofErr w:type="spellStart"/>
-      <w:r>
-        <w:rPr>
-          <w:rFonts w:ascii="Calibri" w:hAnsi="Calibri" w:cs="Calibri"/>
-          <w:sz w:val="20"/>
-          <w:szCs w:val="20"/>
-        </w:rPr>
-        <w:t>Sprints</w:t>
-      </w:r>
-      <w:proofErr w:type="spellEnd"/>
-      <w:r>
-        <w:rPr>
-          <w:rFonts w:ascii="Calibri" w:hAnsi="Calibri" w:cs="Calibri"/>
-          <w:sz w:val="20"/>
-          <w:szCs w:val="20"/>
-        </w:rPr>
-        <w:t xml:space="preserve"> siguientes.</w:t>
+        <w:t xml:space="preserve">La trazabilidad muestra cómo la persistencia se apoya en el monitoreo del Sprint 01 y cómo prepara el trabajo de los Sprints siguientes.</w:t>
       </w:r>
     </w:p>
     <w:p>
@@ -13286,25 +11055,7 @@
           <w:sz w:val="20"/>
           <w:szCs w:val="20"/>
         </w:rPr>
-        <w:t xml:space="preserve">Al finalizar el Sprint 02 deberá ser posible comprobar que </w:t>
-      </w:r>
-      <w:proofErr w:type="spellStart"/>
-      <w:r>
-        <w:rPr>
-          <w:rFonts w:ascii="Calibri" w:hAnsi="Calibri" w:cs="Calibri"/>
-          <w:sz w:val="20"/>
-          <w:szCs w:val="20"/>
-        </w:rPr>
-        <w:t>ErgoSense</w:t>
-      </w:r>
-      <w:proofErr w:type="spellEnd"/>
-      <w:r>
-        <w:rPr>
-          <w:rFonts w:ascii="Calibri" w:hAnsi="Calibri" w:cs="Calibri"/>
-          <w:sz w:val="20"/>
-          <w:szCs w:val="20"/>
-        </w:rPr>
-        <w:t>:</w:t>
+        <w:t xml:space="preserve">Al finalizar el Sprint 02 deberá ser posible comprobar que ErgoSense:</w:t>
       </w:r>
     </w:p>
     <w:p>
@@ -13477,25 +11228,7 @@
           <w:sz w:val="20"/>
           <w:szCs w:val="20"/>
         </w:rPr>
-        <w:t xml:space="preserve">Al contar con la tabla </w:t>
-      </w:r>
-      <w:proofErr w:type="spellStart"/>
-      <w:r>
-        <w:rPr>
-          <w:rFonts w:ascii="Calibri" w:hAnsi="Calibri" w:cs="Calibri"/>
-          <w:sz w:val="20"/>
-          <w:szCs w:val="20"/>
-        </w:rPr>
-        <w:t>settings</w:t>
-      </w:r>
-      <w:proofErr w:type="spellEnd"/>
-      <w:r>
-        <w:rPr>
-          <w:rFonts w:ascii="Calibri" w:hAnsi="Calibri" w:cs="Calibri"/>
-          <w:sz w:val="20"/>
-          <w:szCs w:val="20"/>
-        </w:rPr>
-        <w:t xml:space="preserve"> y con una configuración por defecto, el Sprint 03 podrá enfocarse en que el usuario modifique y conserve sus preferencias, al mismo tiempo que incorpora el control mediante gestos.</w:t>
+        <w:t xml:space="preserve">Al contar con la tabla settings y con una configuración por defecto, el Sprint 03 podrá enfocarse en que el usuario modifique y conserve sus preferencias, al mismo tiempo que incorpora el control mediante gestos.</w:t>
       </w:r>
     </w:p>
     <w:sectPr>

</xml_diff>